<commit_message>
update the code files
</commit_message>
<xml_diff>
--- a/doc/project-report.docx
+++ b/doc/project-report.docx
@@ -1586,43 +1586,61 @@
           <w:sz w:val="24"/>
           <w:szCs w:val="24"/>
         </w:rPr>
-        <w:t xml:space="preserve">Intended to show a single patient's full profile together with their appointment and billing history (the controller already loads both relationships).</w:t>
-      </w:r>
-    </w:p>
-    <w:p>
-      <w:pPr>
-        <w:pStyle w:val="ListParagraph"/>
-        <w:numPr>
-          <w:ilvl w:val="0"/>
-          <w:numId w:val="1"/>
-        </w:numPr>
-        <w:spacing w:after="80"/>
-      </w:pPr>
-      <w:r>
-        <w:rPr>
-          <w:rFonts w:ascii="Times New Roman" w:cs="Times New Roman" w:eastAsia="Times New Roman" w:hAnsi="Times New Roman"/>
-          <w:sz w:val="24"/>
-          <w:szCs w:val="24"/>
-        </w:rPr>
-        <w:t xml:space="preserve">Not currently reachable: the patients.show Blade view has not been created yet</w:t>
-      </w:r>
-    </w:p>
-    <w:p>
-      <w:pPr>
-        <w:pStyle w:val="ListParagraph"/>
-        <w:numPr>
-          <w:ilvl w:val="0"/>
-          <w:numId w:val="1"/>
-        </w:numPr>
-        <w:spacing w:after="80"/>
-      </w:pPr>
-      <w:r>
-        <w:rPr>
-          <w:rFonts w:ascii="Times New Roman" w:cs="Times New Roman" w:eastAsia="Times New Roman" w:hAnsi="Times New Roman"/>
-          <w:sz w:val="24"/>
-          <w:szCs w:val="24"/>
-        </w:rPr>
-        <w:t xml:space="preserve">Visiting it returns a server error ("View [patients.show] not found")</w:t>
+        <w:t xml:space="preserve">Shows a single patient's full profile together with their appointment and billing history.</w:t>
+      </w:r>
+    </w:p>
+    <w:p>
+      <w:pPr>
+        <w:pStyle w:val="ListParagraph"/>
+        <w:numPr>
+          <w:ilvl w:val="0"/>
+          <w:numId w:val="1"/>
+        </w:numPr>
+        <w:spacing w:after="80"/>
+      </w:pPr>
+      <w:r>
+        <w:rPr>
+          <w:rFonts w:ascii="Times New Roman" w:cs="Times New Roman" w:eastAsia="Times New Roman" w:hAnsi="Times New Roman"/>
+          <w:sz w:val="24"/>
+          <w:szCs w:val="24"/>
+        </w:rPr>
+        <w:t xml:space="preserve">Patient demographic summary (age, gender, contact, address, medical notes)</w:t>
+      </w:r>
+    </w:p>
+    <w:p>
+      <w:pPr>
+        <w:pStyle w:val="ListParagraph"/>
+        <w:numPr>
+          <w:ilvl w:val="0"/>
+          <w:numId w:val="1"/>
+        </w:numPr>
+        <w:spacing w:after="80"/>
+      </w:pPr>
+      <w:r>
+        <w:rPr>
+          <w:rFonts w:ascii="Times New Roman" w:cs="Times New Roman" w:eastAsia="Times New Roman" w:hAnsi="Times New Roman"/>
+          <w:sz w:val="24"/>
+          <w:szCs w:val="24"/>
+        </w:rPr>
+        <w:t xml:space="preserve">Appointment history table with doctor, reason and status</w:t>
+      </w:r>
+    </w:p>
+    <w:p>
+      <w:pPr>
+        <w:pStyle w:val="ListParagraph"/>
+        <w:numPr>
+          <w:ilvl w:val="0"/>
+          <w:numId w:val="1"/>
+        </w:numPr>
+        <w:spacing w:after="80"/>
+      </w:pPr>
+      <w:r>
+        <w:rPr>
+          <w:rFonts w:ascii="Times New Roman" w:cs="Times New Roman" w:eastAsia="Times New Roman" w:hAnsi="Times New Roman"/>
+          <w:sz w:val="24"/>
+          <w:szCs w:val="24"/>
+        </w:rPr>
+        <w:t xml:space="preserve">Billing history table with invoice status and a link to each invoice</w:t>
       </w:r>
     </w:p>
     <w:p>
@@ -1631,435 +1649,9 @@
         <w:jc w:val="center"/>
       </w:pPr>
       <w:r>
-        <w:rPr>
-          <w:rFonts w:ascii="Times New Roman" w:cs="Times New Roman" w:eastAsia="Times New Roman" w:hAnsi="Times New Roman"/>
-          <w:b/>
-          <w:bCs/>
-          <w:sz w:val="24"/>
-          <w:szCs w:val="24"/>
-        </w:rPr>
-        <w:t xml:space="preserve">[SCREENSHOT MISSING — insert manually]</w:t>
-      </w:r>
-    </w:p>
-    <w:p>
-      <w:pPr>
-        <w:pStyle w:val="Heading2"/>
-        <w:spacing w:after="120" w:before="300"/>
-      </w:pPr>
-      <w:r>
-        <w:rPr>
-          <w:rFonts w:ascii="Times New Roman" w:cs="Times New Roman" w:eastAsia="Times New Roman" w:hAnsi="Times New Roman"/>
-          <w:b/>
-          <w:bCs/>
-        </w:rPr>
-        <w:t xml:space="preserve">Edit Patient</w:t>
-      </w:r>
-    </w:p>
-    <w:p>
-      <w:pPr>
-        <w:spacing w:after="200" w:line="276"/>
-        <w:jc w:val="both"/>
-      </w:pPr>
-      <w:r>
-        <w:rPr>
-          <w:rFonts w:ascii="Times New Roman" w:cs="Times New Roman" w:eastAsia="Times New Roman" w:hAnsi="Times New Roman"/>
-          <w:sz w:val="24"/>
-          <w:szCs w:val="24"/>
-        </w:rPr>
-        <w:t xml:space="preserve">Intended to pre-fill the patient form for updating an existing record.</w:t>
-      </w:r>
-    </w:p>
-    <w:p>
-      <w:pPr>
-        <w:pStyle w:val="ListParagraph"/>
-        <w:numPr>
-          <w:ilvl w:val="0"/>
-          <w:numId w:val="1"/>
-        </w:numPr>
-        <w:spacing w:after="80"/>
-      </w:pPr>
-      <w:r>
-        <w:rPr>
-          <w:rFonts w:ascii="Times New Roman" w:cs="Times New Roman" w:eastAsia="Times New Roman" w:hAnsi="Times New Roman"/>
-          <w:sz w:val="24"/>
-          <w:szCs w:val="24"/>
-        </w:rPr>
-        <w:t xml:space="preserve">Not currently reachable: the patients.edit Blade view has not been created yet</w:t>
-      </w:r>
-    </w:p>
-    <w:p>
-      <w:pPr>
-        <w:spacing w:after="300" w:before="120"/>
-        <w:jc w:val="center"/>
-      </w:pPr>
-      <w:r>
-        <w:rPr>
-          <w:rFonts w:ascii="Times New Roman" w:cs="Times New Roman" w:eastAsia="Times New Roman" w:hAnsi="Times New Roman"/>
-          <w:b/>
-          <w:bCs/>
-          <w:sz w:val="24"/>
-          <w:szCs w:val="24"/>
-        </w:rPr>
-        <w:t xml:space="preserve">[SCREENSHOT MISSING — insert manually]</w:t>
-      </w:r>
-    </w:p>
-    <w:p>
-      <w:pPr>
-        <w:pStyle w:val="Heading2"/>
-        <w:spacing w:after="120" w:before="300"/>
-      </w:pPr>
-      <w:r>
-        <w:rPr>
-          <w:rFonts w:ascii="Times New Roman" w:cs="Times New Roman" w:eastAsia="Times New Roman" w:hAnsi="Times New Roman"/>
-          <w:b/>
-          <w:bCs/>
-        </w:rPr>
-        <w:t xml:space="preserve">Doctor Directory</w:t>
-      </w:r>
-    </w:p>
-    <w:p>
-      <w:pPr>
-        <w:spacing w:after="200" w:line="276"/>
-        <w:jc w:val="both"/>
-      </w:pPr>
-      <w:r>
-        <w:rPr>
-          <w:rFonts w:ascii="Times New Roman" w:cs="Times New Roman" w:eastAsia="Times New Roman" w:hAnsi="Times New Roman"/>
-          <w:sz w:val="24"/>
-          <w:szCs w:val="24"/>
-        </w:rPr>
-        <w:t xml:space="preserve">Intended to list all doctors with specialization and working hours, for Admin management.</w:t>
-      </w:r>
-    </w:p>
-    <w:p>
-      <w:pPr>
-        <w:pStyle w:val="ListParagraph"/>
-        <w:numPr>
-          <w:ilvl w:val="0"/>
-          <w:numId w:val="1"/>
-        </w:numPr>
-        <w:spacing w:after="80"/>
-      </w:pPr>
-      <w:r>
-        <w:rPr>
-          <w:rFonts w:ascii="Times New Roman" w:cs="Times New Roman" w:eastAsia="Times New Roman" w:hAnsi="Times New Roman"/>
-          <w:sz w:val="24"/>
-          <w:szCs w:val="24"/>
-        </w:rPr>
-        <w:t xml:space="preserve">Not currently reachable: no view files exist yet under resources/views/doctors/</w:t>
-      </w:r>
-    </w:p>
-    <w:p>
-      <w:pPr>
-        <w:spacing w:after="300" w:before="120"/>
-        <w:jc w:val="center"/>
-      </w:pPr>
-      <w:r>
-        <w:rPr>
-          <w:rFonts w:ascii="Times New Roman" w:cs="Times New Roman" w:eastAsia="Times New Roman" w:hAnsi="Times New Roman"/>
-          <w:b/>
-          <w:bCs/>
-          <w:sz w:val="24"/>
-          <w:szCs w:val="24"/>
-        </w:rPr>
-        <w:t xml:space="preserve">[SCREENSHOT MISSING — insert manually]</w:t>
-      </w:r>
-    </w:p>
-    <w:p>
-      <w:pPr>
-        <w:pStyle w:val="Heading2"/>
-        <w:spacing w:after="120" w:before="300"/>
-      </w:pPr>
-      <w:r>
-        <w:rPr>
-          <w:rFonts w:ascii="Times New Roman" w:cs="Times New Roman" w:eastAsia="Times New Roman" w:hAnsi="Times New Roman"/>
-          <w:b/>
-          <w:bCs/>
-        </w:rPr>
-        <w:t xml:space="preserve">Add Doctor</w:t>
-      </w:r>
-    </w:p>
-    <w:p>
-      <w:pPr>
-        <w:spacing w:after="200" w:line="276"/>
-        <w:jc w:val="both"/>
-      </w:pPr>
-      <w:r>
-        <w:rPr>
-          <w:rFonts w:ascii="Times New Roman" w:cs="Times New Roman" w:eastAsia="Times New Roman" w:hAnsi="Times New Roman"/>
-          <w:sz w:val="24"/>
-          <w:szCs w:val="24"/>
-        </w:rPr>
-        <w:t xml:space="preserve">Intended form to register a new doctor (name, specialization, contact, working hours).</w:t>
-      </w:r>
-    </w:p>
-    <w:p>
-      <w:pPr>
-        <w:pStyle w:val="ListParagraph"/>
-        <w:numPr>
-          <w:ilvl w:val="0"/>
-          <w:numId w:val="1"/>
-        </w:numPr>
-        <w:spacing w:after="80"/>
-      </w:pPr>
-      <w:r>
-        <w:rPr>
-          <w:rFonts w:ascii="Times New Roman" w:cs="Times New Roman" w:eastAsia="Times New Roman" w:hAnsi="Times New Roman"/>
-          <w:sz w:val="24"/>
-          <w:szCs w:val="24"/>
-        </w:rPr>
-        <w:t xml:space="preserve">Not currently reachable: the doctors.create Blade view has not been created yet</w:t>
-      </w:r>
-    </w:p>
-    <w:p>
-      <w:pPr>
-        <w:spacing w:after="300" w:before="120"/>
-        <w:jc w:val="center"/>
-      </w:pPr>
-      <w:r>
-        <w:rPr>
-          <w:rFonts w:ascii="Times New Roman" w:cs="Times New Roman" w:eastAsia="Times New Roman" w:hAnsi="Times New Roman"/>
-          <w:b/>
-          <w:bCs/>
-          <w:sz w:val="24"/>
-          <w:szCs w:val="24"/>
-        </w:rPr>
-        <w:t xml:space="preserve">[SCREENSHOT MISSING — insert manually]</w:t>
-      </w:r>
-    </w:p>
-    <w:p>
-      <w:pPr>
-        <w:pStyle w:val="Heading2"/>
-        <w:spacing w:after="120" w:before="300"/>
-      </w:pPr>
-      <w:r>
-        <w:rPr>
-          <w:rFonts w:ascii="Times New Roman" w:cs="Times New Roman" w:eastAsia="Times New Roman" w:hAnsi="Times New Roman"/>
-          <w:b/>
-          <w:bCs/>
-        </w:rPr>
-        <w:t xml:space="preserve">Doctor Profile</w:t>
-      </w:r>
-    </w:p>
-    <w:p>
-      <w:pPr>
-        <w:spacing w:after="200" w:line="276"/>
-        <w:jc w:val="both"/>
-      </w:pPr>
-      <w:r>
-        <w:rPr>
-          <w:rFonts w:ascii="Times New Roman" w:cs="Times New Roman" w:eastAsia="Times New Roman" w:hAnsi="Times New Roman"/>
-          <w:sz w:val="24"/>
-          <w:szCs w:val="24"/>
-        </w:rPr>
-        <w:t xml:space="preserve">Intended to show a single doctor's details together with their appointments.</w:t>
-      </w:r>
-    </w:p>
-    <w:p>
-      <w:pPr>
-        <w:pStyle w:val="ListParagraph"/>
-        <w:numPr>
-          <w:ilvl w:val="0"/>
-          <w:numId w:val="1"/>
-        </w:numPr>
-        <w:spacing w:after="80"/>
-      </w:pPr>
-      <w:r>
-        <w:rPr>
-          <w:rFonts w:ascii="Times New Roman" w:cs="Times New Roman" w:eastAsia="Times New Roman" w:hAnsi="Times New Roman"/>
-          <w:sz w:val="24"/>
-          <w:szCs w:val="24"/>
-        </w:rPr>
-        <w:t xml:space="preserve">Not currently reachable: the doctors.show Blade view has not been created yet</w:t>
-      </w:r>
-    </w:p>
-    <w:p>
-      <w:pPr>
-        <w:spacing w:after="300" w:before="120"/>
-        <w:jc w:val="center"/>
-      </w:pPr>
-      <w:r>
-        <w:rPr>
-          <w:rFonts w:ascii="Times New Roman" w:cs="Times New Roman" w:eastAsia="Times New Roman" w:hAnsi="Times New Roman"/>
-          <w:b/>
-          <w:bCs/>
-          <w:sz w:val="24"/>
-          <w:szCs w:val="24"/>
-        </w:rPr>
-        <w:t xml:space="preserve">[SCREENSHOT MISSING — insert manually]</w:t>
-      </w:r>
-    </w:p>
-    <w:p>
-      <w:pPr>
-        <w:pStyle w:val="Heading2"/>
-        <w:spacing w:after="120" w:before="300"/>
-      </w:pPr>
-      <w:r>
-        <w:rPr>
-          <w:rFonts w:ascii="Times New Roman" w:cs="Times New Roman" w:eastAsia="Times New Roman" w:hAnsi="Times New Roman"/>
-          <w:b/>
-          <w:bCs/>
-        </w:rPr>
-        <w:t xml:space="preserve">Edit Doctor</w:t>
-      </w:r>
-    </w:p>
-    <w:p>
-      <w:pPr>
-        <w:spacing w:after="200" w:line="276"/>
-        <w:jc w:val="both"/>
-      </w:pPr>
-      <w:r>
-        <w:rPr>
-          <w:rFonts w:ascii="Times New Roman" w:cs="Times New Roman" w:eastAsia="Times New Roman" w:hAnsi="Times New Roman"/>
-          <w:sz w:val="24"/>
-          <w:szCs w:val="24"/>
-        </w:rPr>
-        <w:t xml:space="preserve">Intended form to update an existing doctor's details.</w:t>
-      </w:r>
-    </w:p>
-    <w:p>
-      <w:pPr>
-        <w:pStyle w:val="ListParagraph"/>
-        <w:numPr>
-          <w:ilvl w:val="0"/>
-          <w:numId w:val="1"/>
-        </w:numPr>
-        <w:spacing w:after="80"/>
-      </w:pPr>
-      <w:r>
-        <w:rPr>
-          <w:rFonts w:ascii="Times New Roman" w:cs="Times New Roman" w:eastAsia="Times New Roman" w:hAnsi="Times New Roman"/>
-          <w:sz w:val="24"/>
-          <w:szCs w:val="24"/>
-        </w:rPr>
-        <w:t xml:space="preserve">Not currently reachable: the doctors.edit Blade view has not been created yet</w:t>
-      </w:r>
-    </w:p>
-    <w:p>
-      <w:pPr>
-        <w:spacing w:after="300" w:before="120"/>
-        <w:jc w:val="center"/>
-      </w:pPr>
-      <w:r>
-        <w:rPr>
-          <w:rFonts w:ascii="Times New Roman" w:cs="Times New Roman" w:eastAsia="Times New Roman" w:hAnsi="Times New Roman"/>
-          <w:b/>
-          <w:bCs/>
-          <w:sz w:val="24"/>
-          <w:szCs w:val="24"/>
-        </w:rPr>
-        <w:t xml:space="preserve">[SCREENSHOT MISSING — insert manually]</w:t>
-      </w:r>
-    </w:p>
-    <w:p>
-      <w:pPr>
-        <w:pStyle w:val="Heading2"/>
-        <w:spacing w:after="120" w:before="300"/>
-      </w:pPr>
-      <w:r>
-        <w:rPr>
-          <w:rFonts w:ascii="Times New Roman" w:cs="Times New Roman" w:eastAsia="Times New Roman" w:hAnsi="Times New Roman"/>
-          <w:b/>
-          <w:bCs/>
-        </w:rPr>
-        <w:t xml:space="preserve">Book New Appointment</w:t>
-      </w:r>
-    </w:p>
-    <w:p>
-      <w:pPr>
-        <w:spacing w:after="200" w:line="276"/>
-        <w:jc w:val="both"/>
-      </w:pPr>
-      <w:r>
-        <w:rPr>
-          <w:rFonts w:ascii="Times New Roman" w:cs="Times New Roman" w:eastAsia="Times New Roman" w:hAnsi="Times New Roman"/>
-          <w:sz w:val="24"/>
-          <w:szCs w:val="24"/>
-        </w:rPr>
-        <w:t xml:space="preserve">Interactive scheduler used by Admin and Receptionist to book a patient with a doctor.</w:t>
-      </w:r>
-    </w:p>
-    <w:p>
-      <w:pPr>
-        <w:pStyle w:val="ListParagraph"/>
-        <w:numPr>
-          <w:ilvl w:val="0"/>
-          <w:numId w:val="1"/>
-        </w:numPr>
-        <w:spacing w:after="80"/>
-      </w:pPr>
-      <w:r>
-        <w:rPr>
-          <w:rFonts w:ascii="Times New Roman" w:cs="Times New Roman" w:eastAsia="Times New Roman" w:hAnsi="Times New Roman"/>
-          <w:sz w:val="24"/>
-          <w:szCs w:val="24"/>
-        </w:rPr>
-        <w:t xml:space="preserve">14-day rolling date picker</w:t>
-      </w:r>
-    </w:p>
-    <w:p>
-      <w:pPr>
-        <w:pStyle w:val="ListParagraph"/>
-        <w:numPr>
-          <w:ilvl w:val="0"/>
-          <w:numId w:val="1"/>
-        </w:numPr>
-        <w:spacing w:after="80"/>
-      </w:pPr>
-      <w:r>
-        <w:rPr>
-          <w:rFonts w:ascii="Times New Roman" w:cs="Times New Roman" w:eastAsia="Times New Roman" w:hAnsi="Times New Roman"/>
-          <w:sz w:val="24"/>
-          <w:szCs w:val="24"/>
-        </w:rPr>
-        <w:t xml:space="preserve">Morning and afternoon time-slot grid showing live availability</w:t>
-      </w:r>
-    </w:p>
-    <w:p>
-      <w:pPr>
-        <w:pStyle w:val="ListParagraph"/>
-        <w:numPr>
-          <w:ilvl w:val="0"/>
-          <w:numId w:val="1"/>
-        </w:numPr>
-        <w:spacing w:after="80"/>
-      </w:pPr>
-      <w:r>
-        <w:rPr>
-          <w:rFonts w:ascii="Times New Roman" w:cs="Times New Roman" w:eastAsia="Times New Roman" w:hAnsi="Times New Roman"/>
-          <w:sz w:val="24"/>
-          <w:szCs w:val="24"/>
-        </w:rPr>
-        <w:t xml:space="preserve">Patient and doctor selection</w:t>
-      </w:r>
-    </w:p>
-    <w:p>
-      <w:pPr>
-        <w:pStyle w:val="ListParagraph"/>
-        <w:numPr>
-          <w:ilvl w:val="0"/>
-          <w:numId w:val="1"/>
-        </w:numPr>
-        <w:spacing w:after="80"/>
-      </w:pPr>
-      <w:r>
-        <w:rPr>
-          <w:rFonts w:ascii="Times New Roman" w:cs="Times New Roman" w:eastAsia="Times New Roman" w:hAnsi="Times New Roman"/>
-          <w:sz w:val="24"/>
-          <w:szCs w:val="24"/>
-        </w:rPr>
-        <w:t xml:space="preserve">AJAX conflict check against existing bookings before submission</w:t>
-      </w:r>
-    </w:p>
-    <w:p>
-      <w:pPr>
-        <w:spacing w:after="300" w:before="120"/>
-        <w:jc w:val="center"/>
-      </w:pPr>
-      <w:r>
         <w:drawing>
           <wp:inline distT="0" distB="0" distL="0" distR="0">
-            <wp:extent cx="5524500" cy="3933825"/>
+            <wp:extent cx="5524500" cy="4295775"/>
             <wp:effectExtent t="0" r="0" b="0" l="0"/>
             <wp:docPr id="1" name="" descr="" title=""/>
             <wp:cNvGraphicFramePr>
@@ -2084,7 +1676,7 @@
                   <pic:spPr bwMode="auto">
                     <a:xfrm>
                       <a:off x="0" y="0"/>
-                      <a:ext cx="5524500" cy="3933825"/>
+                      <a:ext cx="5524500" cy="4295775"/>
                     </a:xfrm>
                     <a:prstGeom prst="rect">
                       <a:avLst/>
@@ -2108,7 +1700,7 @@
           <w:b/>
           <w:bCs/>
         </w:rPr>
-        <w:t xml:space="preserve">Appointments List</w:t>
+        <w:t xml:space="preserve">Edit Patient</w:t>
       </w:r>
     </w:p>
     <w:p>
@@ -2122,43 +1714,43 @@
           <w:sz w:val="24"/>
           <w:szCs w:val="24"/>
         </w:rPr>
-        <w:t xml:space="preserve">Intended to list appointments, filtered by role (all appointments for Admin/Receptionist, own appointments only for Doctor).</w:t>
-      </w:r>
-    </w:p>
-    <w:p>
-      <w:pPr>
-        <w:pStyle w:val="ListParagraph"/>
-        <w:numPr>
-          <w:ilvl w:val="0"/>
-          <w:numId w:val="1"/>
-        </w:numPr>
-        <w:spacing w:after="80"/>
-      </w:pPr>
-      <w:r>
-        <w:rPr>
-          <w:rFonts w:ascii="Times New Roman" w:cs="Times New Roman" w:eastAsia="Times New Roman" w:hAnsi="Times New Roman"/>
-          <w:sz w:val="24"/>
-          <w:szCs w:val="24"/>
-        </w:rPr>
-        <w:t xml:space="preserve">Not currently reachable: the appointments.index Blade view has not been created yet</w:t>
-      </w:r>
-    </w:p>
-    <w:p>
-      <w:pPr>
-        <w:pStyle w:val="ListParagraph"/>
-        <w:numPr>
-          <w:ilvl w:val="0"/>
-          <w:numId w:val="1"/>
-        </w:numPr>
-        <w:spacing w:after="80"/>
-      </w:pPr>
-      <w:r>
-        <w:rPr>
-          <w:rFonts w:ascii="Times New Roman" w:cs="Times New Roman" w:eastAsia="Times New Roman" w:hAnsi="Times New Roman"/>
-          <w:sz w:val="24"/>
-          <w:szCs w:val="24"/>
-        </w:rPr>
-        <w:t xml:space="preserve">A routing issue was also found: two routes in web.php are both named "appointments.index" (one restricted to Admin/Receptionist, one to Doctor) for the same GET /appointments URL — the second definition silently overrides the first, so the route Admin/Receptionist actually hit is doctor-only</w:t>
+        <w:t xml:space="preserve">Pre-fills the patient registration form so an existing record can be updated.</w:t>
+      </w:r>
+    </w:p>
+    <w:p>
+      <w:pPr>
+        <w:pStyle w:val="ListParagraph"/>
+        <w:numPr>
+          <w:ilvl w:val="0"/>
+          <w:numId w:val="1"/>
+        </w:numPr>
+        <w:spacing w:after="80"/>
+      </w:pPr>
+      <w:r>
+        <w:rPr>
+          <w:rFonts w:ascii="Times New Roman" w:cs="Times New Roman" w:eastAsia="Times New Roman" w:hAnsi="Times New Roman"/>
+          <w:sz w:val="24"/>
+          <w:szCs w:val="24"/>
+        </w:rPr>
+        <w:t xml:space="preserve">Same fields as registration, pre-populated from the existing record</w:t>
+      </w:r>
+    </w:p>
+    <w:p>
+      <w:pPr>
+        <w:pStyle w:val="ListParagraph"/>
+        <w:numPr>
+          <w:ilvl w:val="0"/>
+          <w:numId w:val="1"/>
+        </w:numPr>
+        <w:spacing w:after="80"/>
+      </w:pPr>
+      <w:r>
+        <w:rPr>
+          <w:rFonts w:ascii="Times New Roman" w:cs="Times New Roman" w:eastAsia="Times New Roman" w:hAnsi="Times New Roman"/>
+          <w:sz w:val="24"/>
+          <w:szCs w:val="24"/>
+        </w:rPr>
+        <w:t xml:space="preserve">Server-side validation identical to patient creation</w:t>
       </w:r>
     </w:p>
     <w:p>
@@ -2167,249 +1759,9 @@
         <w:jc w:val="center"/>
       </w:pPr>
       <w:r>
-        <w:rPr>
-          <w:rFonts w:ascii="Times New Roman" w:cs="Times New Roman" w:eastAsia="Times New Roman" w:hAnsi="Times New Roman"/>
-          <w:b/>
-          <w:bCs/>
-          <w:sz w:val="24"/>
-          <w:szCs w:val="24"/>
-        </w:rPr>
-        <w:t xml:space="preserve">[SCREENSHOT MISSING — insert manually]</w:t>
-      </w:r>
-    </w:p>
-    <w:p>
-      <w:pPr>
-        <w:pStyle w:val="Heading2"/>
-        <w:spacing w:after="120" w:before="300"/>
-      </w:pPr>
-      <w:r>
-        <w:rPr>
-          <w:rFonts w:ascii="Times New Roman" w:cs="Times New Roman" w:eastAsia="Times New Roman" w:hAnsi="Times New Roman"/>
-          <w:b/>
-          <w:bCs/>
-        </w:rPr>
-        <w:t xml:space="preserve">Appointment Details</w:t>
-      </w:r>
-    </w:p>
-    <w:p>
-      <w:pPr>
-        <w:spacing w:after="200" w:line="276"/>
-        <w:jc w:val="both"/>
-      </w:pPr>
-      <w:r>
-        <w:rPr>
-          <w:rFonts w:ascii="Times New Roman" w:cs="Times New Roman" w:eastAsia="Times New Roman" w:hAnsi="Times New Roman"/>
-          <w:sz w:val="24"/>
-          <w:szCs w:val="24"/>
-        </w:rPr>
-        <w:t xml:space="preserve">Intended to show a single appointment with its linked patient, doctor and billing record.</w:t>
-      </w:r>
-    </w:p>
-    <w:p>
-      <w:pPr>
-        <w:pStyle w:val="ListParagraph"/>
-        <w:numPr>
-          <w:ilvl w:val="0"/>
-          <w:numId w:val="1"/>
-        </w:numPr>
-        <w:spacing w:after="80"/>
-      </w:pPr>
-      <w:r>
-        <w:rPr>
-          <w:rFonts w:ascii="Times New Roman" w:cs="Times New Roman" w:eastAsia="Times New Roman" w:hAnsi="Times New Roman"/>
-          <w:sz w:val="24"/>
-          <w:szCs w:val="24"/>
-        </w:rPr>
-        <w:t xml:space="preserve">Not currently reachable: the appointments.show Blade view has not been created yet</w:t>
-      </w:r>
-    </w:p>
-    <w:p>
-      <w:pPr>
-        <w:spacing w:after="300" w:before="120"/>
-        <w:jc w:val="center"/>
-      </w:pPr>
-      <w:r>
-        <w:rPr>
-          <w:rFonts w:ascii="Times New Roman" w:cs="Times New Roman" w:eastAsia="Times New Roman" w:hAnsi="Times New Roman"/>
-          <w:b/>
-          <w:bCs/>
-          <w:sz w:val="24"/>
-          <w:szCs w:val="24"/>
-        </w:rPr>
-        <w:t xml:space="preserve">[SCREENSHOT MISSING — insert manually]</w:t>
-      </w:r>
-    </w:p>
-    <w:p>
-      <w:pPr>
-        <w:pStyle w:val="Heading2"/>
-        <w:spacing w:after="120" w:before="300"/>
-      </w:pPr>
-      <w:r>
-        <w:rPr>
-          <w:rFonts w:ascii="Times New Roman" w:cs="Times New Roman" w:eastAsia="Times New Roman" w:hAnsi="Times New Roman"/>
-          <w:b/>
-          <w:bCs/>
-        </w:rPr>
-        <w:t xml:space="preserve">Edit Appointment</w:t>
-      </w:r>
-    </w:p>
-    <w:p>
-      <w:pPr>
-        <w:spacing w:after="200" w:line="276"/>
-        <w:jc w:val="both"/>
-      </w:pPr>
-      <w:r>
-        <w:rPr>
-          <w:rFonts w:ascii="Times New Roman" w:cs="Times New Roman" w:eastAsia="Times New Roman" w:hAnsi="Times New Roman"/>
-          <w:sz w:val="24"/>
-          <w:szCs w:val="24"/>
-        </w:rPr>
-        <w:t xml:space="preserve">Intended form to reschedule or update an existing appointment, with the same availability check used on creation.</w:t>
-      </w:r>
-    </w:p>
-    <w:p>
-      <w:pPr>
-        <w:pStyle w:val="ListParagraph"/>
-        <w:numPr>
-          <w:ilvl w:val="0"/>
-          <w:numId w:val="1"/>
-        </w:numPr>
-        <w:spacing w:after="80"/>
-      </w:pPr>
-      <w:r>
-        <w:rPr>
-          <w:rFonts w:ascii="Times New Roman" w:cs="Times New Roman" w:eastAsia="Times New Roman" w:hAnsi="Times New Roman"/>
-          <w:sz w:val="24"/>
-          <w:szCs w:val="24"/>
-        </w:rPr>
-        <w:t xml:space="preserve">Not currently reachable: the appointments.edit Blade view has not been created yet</w:t>
-      </w:r>
-    </w:p>
-    <w:p>
-      <w:pPr>
-        <w:spacing w:after="300" w:before="120"/>
-        <w:jc w:val="center"/>
-      </w:pPr>
-      <w:r>
-        <w:rPr>
-          <w:rFonts w:ascii="Times New Roman" w:cs="Times New Roman" w:eastAsia="Times New Roman" w:hAnsi="Times New Roman"/>
-          <w:b/>
-          <w:bCs/>
-          <w:sz w:val="24"/>
-          <w:szCs w:val="24"/>
-        </w:rPr>
-        <w:t xml:space="preserve">[SCREENSHOT MISSING — insert manually]</w:t>
-      </w:r>
-    </w:p>
-    <w:p>
-      <w:pPr>
-        <w:pStyle w:val="Heading2"/>
-        <w:spacing w:after="120" w:before="300"/>
-      </w:pPr>
-      <w:r>
-        <w:rPr>
-          <w:rFonts w:ascii="Times New Roman" w:cs="Times New Roman" w:eastAsia="Times New Roman" w:hAnsi="Times New Roman"/>
-          <w:b/>
-          <w:bCs/>
-        </w:rPr>
-        <w:t xml:space="preserve">Create Invoice</w:t>
-      </w:r>
-    </w:p>
-    <w:p>
-      <w:pPr>
-        <w:spacing w:after="200" w:line="276"/>
-        <w:jc w:val="both"/>
-      </w:pPr>
-      <w:r>
-        <w:rPr>
-          <w:rFonts w:ascii="Times New Roman" w:cs="Times New Roman" w:eastAsia="Times New Roman" w:hAnsi="Times New Roman"/>
-          <w:sz w:val="24"/>
-          <w:szCs w:val="24"/>
-        </w:rPr>
-        <w:t xml:space="preserve">Form used by Admin and Receptionist to generate a new patient invoice.</w:t>
-      </w:r>
-    </w:p>
-    <w:p>
-      <w:pPr>
-        <w:pStyle w:val="ListParagraph"/>
-        <w:numPr>
-          <w:ilvl w:val="0"/>
-          <w:numId w:val="1"/>
-        </w:numPr>
-        <w:spacing w:after="80"/>
-      </w:pPr>
-      <w:r>
-        <w:rPr>
-          <w:rFonts w:ascii="Times New Roman" w:cs="Times New Roman" w:eastAsia="Times New Roman" w:hAnsi="Times New Roman"/>
-          <w:sz w:val="24"/>
-          <w:szCs w:val="24"/>
-        </w:rPr>
-        <w:t xml:space="preserve">Patient and attending-physician selection</w:t>
-      </w:r>
-    </w:p>
-    <w:p>
-      <w:pPr>
-        <w:pStyle w:val="ListParagraph"/>
-        <w:numPr>
-          <w:ilvl w:val="0"/>
-          <w:numId w:val="1"/>
-        </w:numPr>
-        <w:spacing w:after="80"/>
-      </w:pPr>
-      <w:r>
-        <w:rPr>
-          <w:rFonts w:ascii="Times New Roman" w:cs="Times New Roman" w:eastAsia="Times New Roman" w:hAnsi="Times New Roman"/>
-          <w:sz w:val="24"/>
-          <w:szCs w:val="24"/>
-        </w:rPr>
-        <w:t xml:space="preserve">Payment method selection (card, cash, insurance, bank transfer)</w:t>
-      </w:r>
-    </w:p>
-    <w:p>
-      <w:pPr>
-        <w:pStyle w:val="ListParagraph"/>
-        <w:numPr>
-          <w:ilvl w:val="0"/>
-          <w:numId w:val="1"/>
-        </w:numPr>
-        <w:spacing w:after="80"/>
-      </w:pPr>
-      <w:r>
-        <w:rPr>
-          <w:rFonts w:ascii="Times New Roman" w:cs="Times New Roman" w:eastAsia="Times New Roman" w:hAnsi="Times New Roman"/>
-          <w:sz w:val="24"/>
-          <w:szCs w:val="24"/>
-        </w:rPr>
-        <w:t xml:space="preserve">Itemized service line items with running subtotal, tax, discount and total</w:t>
-      </w:r>
-    </w:p>
-    <w:p>
-      <w:pPr>
-        <w:pStyle w:val="ListParagraph"/>
-        <w:numPr>
-          <w:ilvl w:val="0"/>
-          <w:numId w:val="1"/>
-        </w:numPr>
-        <w:spacing w:after="80"/>
-      </w:pPr>
-      <w:r>
-        <w:rPr>
-          <w:rFonts w:ascii="Times New Roman" w:cs="Times New Roman" w:eastAsia="Times New Roman" w:hAnsi="Times New Roman"/>
-          <w:sz w:val="24"/>
-          <w:szCs w:val="24"/>
-        </w:rPr>
-        <w:t xml:space="preserve">"Finalize &amp; Print Invoice" and "Send to Insurance" actions</w:t>
-      </w:r>
-    </w:p>
-    <w:p>
-      <w:pPr>
-        <w:spacing w:after="300" w:before="120"/>
-        <w:jc w:val="center"/>
-      </w:pPr>
-      <w:r>
         <w:drawing>
           <wp:inline distT="0" distB="0" distL="0" distR="0">
-            <wp:extent cx="5524500" cy="3409950"/>
+            <wp:extent cx="5524500" cy="4648200"/>
             <wp:effectExtent t="0" r="0" b="0" l="0"/>
             <wp:docPr id="1" name="" descr="" title=""/>
             <wp:cNvGraphicFramePr>
@@ -2434,7 +1786,7 @@
                   <pic:spPr bwMode="auto">
                     <a:xfrm>
                       <a:off x="0" y="0"/>
-                      <a:ext cx="5524500" cy="3409950"/>
+                      <a:ext cx="5524500" cy="4648200"/>
                     </a:xfrm>
                     <a:prstGeom prst="rect">
                       <a:avLst/>
@@ -2458,7 +1810,7 @@
           <w:b/>
           <w:bCs/>
         </w:rPr>
-        <w:t xml:space="preserve">Invoice List</w:t>
+        <w:t xml:space="preserve">Doctor Directory</w:t>
       </w:r>
     </w:p>
     <w:p>
@@ -2472,309 +1824,61 @@
           <w:sz w:val="24"/>
           <w:szCs w:val="24"/>
         </w:rPr>
-        <w:t xml:space="preserve">Intended to list all invoices with monthly revenue and pending-payment statistics.</w:t>
-      </w:r>
-    </w:p>
-    <w:p>
-      <w:pPr>
-        <w:pStyle w:val="ListParagraph"/>
-        <w:numPr>
-          <w:ilvl w:val="0"/>
-          <w:numId w:val="1"/>
-        </w:numPr>
-        <w:spacing w:after="80"/>
-      </w:pPr>
-      <w:r>
-        <w:rPr>
-          <w:rFonts w:ascii="Times New Roman" w:cs="Times New Roman" w:eastAsia="Times New Roman" w:hAnsi="Times New Roman"/>
-          <w:sz w:val="24"/>
-          <w:szCs w:val="24"/>
-        </w:rPr>
-        <w:t xml:space="preserve">Not currently reachable — this one fails for a different reason than a missing view: BillingController@index eager-loads a doctor() relationship on the Billing model, but Billing.php only defines patient() and appointment(). The mismatch raises a RelationNotFoundException before the (existing) billing.index view is ever rendered.</w:t>
-      </w:r>
-    </w:p>
-    <w:p>
-      <w:pPr>
-        <w:spacing w:after="300" w:before="120"/>
-        <w:jc w:val="center"/>
-      </w:pPr>
-      <w:r>
-        <w:rPr>
-          <w:rFonts w:ascii="Times New Roman" w:cs="Times New Roman" w:eastAsia="Times New Roman" w:hAnsi="Times New Roman"/>
-          <w:b/>
-          <w:bCs/>
-          <w:sz w:val="24"/>
-          <w:szCs w:val="24"/>
-        </w:rPr>
-        <w:t xml:space="preserve">[SCREENSHOT MISSING — insert manually]</w:t>
-      </w:r>
-    </w:p>
-    <w:p>
-      <w:pPr>
-        <w:pStyle w:val="Heading2"/>
-        <w:spacing w:after="120" w:before="300"/>
-      </w:pPr>
-      <w:r>
-        <w:rPr>
-          <w:rFonts w:ascii="Times New Roman" w:cs="Times New Roman" w:eastAsia="Times New Roman" w:hAnsi="Times New Roman"/>
-          <w:b/>
-          <w:bCs/>
-        </w:rPr>
-        <w:t xml:space="preserve">Invoice Details</w:t>
-      </w:r>
-    </w:p>
-    <w:p>
-      <w:pPr>
-        <w:spacing w:after="200" w:line="276"/>
-        <w:jc w:val="both"/>
-      </w:pPr>
-      <w:r>
-        <w:rPr>
-          <w:rFonts w:ascii="Times New Roman" w:cs="Times New Roman" w:eastAsia="Times New Roman" w:hAnsi="Times New Roman"/>
-          <w:sz w:val="24"/>
-          <w:szCs w:val="24"/>
-        </w:rPr>
-        <w:t xml:space="preserve">Intended to show a single invoice with patient, doctor and appointment details, plus a "mark as paid" action.</w:t>
-      </w:r>
-    </w:p>
-    <w:p>
-      <w:pPr>
-        <w:pStyle w:val="ListParagraph"/>
-        <w:numPr>
-          <w:ilvl w:val="0"/>
-          <w:numId w:val="1"/>
-        </w:numPr>
-        <w:spacing w:after="80"/>
-      </w:pPr>
-      <w:r>
-        <w:rPr>
-          <w:rFonts w:ascii="Times New Roman" w:cs="Times New Roman" w:eastAsia="Times New Roman" w:hAnsi="Times New Roman"/>
-          <w:sz w:val="24"/>
-          <w:szCs w:val="24"/>
-        </w:rPr>
-        <w:t xml:space="preserve">Not currently reachable: same missing Billing::doctor() relationship error as the Invoice List page</w:t>
-      </w:r>
-    </w:p>
-    <w:p>
-      <w:pPr>
-        <w:spacing w:after="300" w:before="120"/>
-        <w:jc w:val="center"/>
-      </w:pPr>
-      <w:r>
-        <w:rPr>
-          <w:rFonts w:ascii="Times New Roman" w:cs="Times New Roman" w:eastAsia="Times New Roman" w:hAnsi="Times New Roman"/>
-          <w:b/>
-          <w:bCs/>
-          <w:sz w:val="24"/>
-          <w:szCs w:val="24"/>
-        </w:rPr>
-        <w:t xml:space="preserve">[SCREENSHOT MISSING — insert manually]</w:t>
-      </w:r>
-    </w:p>
-    <w:p>
-      <w:pPr>
-        <w:pStyle w:val="Heading2"/>
-        <w:spacing w:after="120" w:before="300"/>
-      </w:pPr>
-      <w:r>
-        <w:rPr>
-          <w:rFonts w:ascii="Times New Roman" w:cs="Times New Roman" w:eastAsia="Times New Roman" w:hAnsi="Times New Roman"/>
-          <w:b/>
-          <w:bCs/>
-        </w:rPr>
-        <w:t xml:space="preserve">Edit Invoice</w:t>
-      </w:r>
-    </w:p>
-    <w:p>
-      <w:pPr>
-        <w:spacing w:after="200" w:line="276"/>
-        <w:jc w:val="both"/>
-      </w:pPr>
-      <w:r>
-        <w:rPr>
-          <w:rFonts w:ascii="Times New Roman" w:cs="Times New Roman" w:eastAsia="Times New Roman" w:hAnsi="Times New Roman"/>
-          <w:sz w:val="24"/>
-          <w:szCs w:val="24"/>
-        </w:rPr>
-        <w:t xml:space="preserve">Intended form to update an existing invoice's amount, status, payment method or notes.</w:t>
-      </w:r>
-    </w:p>
-    <w:p>
-      <w:pPr>
-        <w:pStyle w:val="ListParagraph"/>
-        <w:numPr>
-          <w:ilvl w:val="0"/>
-          <w:numId w:val="1"/>
-        </w:numPr>
-        <w:spacing w:after="80"/>
-      </w:pPr>
-      <w:r>
-        <w:rPr>
-          <w:rFonts w:ascii="Times New Roman" w:cs="Times New Roman" w:eastAsia="Times New Roman" w:hAnsi="Times New Roman"/>
-          <w:sz w:val="24"/>
-          <w:szCs w:val="24"/>
-        </w:rPr>
-        <w:t xml:space="preserve">Not currently reachable: the billing.edit Blade view has not been created yet</w:t>
-      </w:r>
-    </w:p>
-    <w:p>
-      <w:pPr>
-        <w:spacing w:after="300" w:before="120"/>
-        <w:jc w:val="center"/>
-      </w:pPr>
-      <w:r>
-        <w:rPr>
-          <w:rFonts w:ascii="Times New Roman" w:cs="Times New Roman" w:eastAsia="Times New Roman" w:hAnsi="Times New Roman"/>
-          <w:b/>
-          <w:bCs/>
-          <w:sz w:val="24"/>
-          <w:szCs w:val="24"/>
-        </w:rPr>
-        <w:t xml:space="preserve">[SCREENSHOT MISSING — insert manually]</w:t>
-      </w:r>
-    </w:p>
-    <w:p>
-      <w:pPr>
-        <w:pStyle w:val="Heading2"/>
-        <w:spacing w:after="120" w:before="300"/>
-      </w:pPr>
-      <w:r>
-        <w:rPr>
-          <w:rFonts w:ascii="Times New Roman" w:cs="Times New Roman" w:eastAsia="Times New Roman" w:hAnsi="Times New Roman"/>
-          <w:b/>
-          <w:bCs/>
-        </w:rPr>
-        <w:t xml:space="preserve">Printable Invoice</w:t>
-      </w:r>
-    </w:p>
-    <w:p>
-      <w:pPr>
-        <w:spacing w:after="200" w:line="276"/>
-        <w:jc w:val="both"/>
-      </w:pPr>
-      <w:r>
-        <w:rPr>
-          <w:rFonts w:ascii="Times New Roman" w:cs="Times New Roman" w:eastAsia="Times New Roman" w:hAnsi="Times New Roman"/>
-          <w:sz w:val="24"/>
-          <w:szCs w:val="24"/>
-        </w:rPr>
-        <w:t xml:space="preserve">Intended print-friendly layout of a finalized invoice.</w:t>
-      </w:r>
-    </w:p>
-    <w:p>
-      <w:pPr>
-        <w:pStyle w:val="ListParagraph"/>
-        <w:numPr>
-          <w:ilvl w:val="0"/>
-          <w:numId w:val="1"/>
-        </w:numPr>
-        <w:spacing w:after="80"/>
-      </w:pPr>
-      <w:r>
-        <w:rPr>
-          <w:rFonts w:ascii="Times New Roman" w:cs="Times New Roman" w:eastAsia="Times New Roman" w:hAnsi="Times New Roman"/>
-          <w:sz w:val="24"/>
-          <w:szCs w:val="24"/>
-        </w:rPr>
-        <w:t xml:space="preserve">Not currently reachable: same missing Billing::doctor() relationship error as the Invoice List page</w:t>
-      </w:r>
-    </w:p>
-    <w:p>
-      <w:pPr>
-        <w:spacing w:after="300" w:before="120"/>
-        <w:jc w:val="center"/>
-      </w:pPr>
-      <w:r>
-        <w:rPr>
-          <w:rFonts w:ascii="Times New Roman" w:cs="Times New Roman" w:eastAsia="Times New Roman" w:hAnsi="Times New Roman"/>
-          <w:b/>
-          <w:bCs/>
-          <w:sz w:val="24"/>
-          <w:szCs w:val="24"/>
-        </w:rPr>
-        <w:t xml:space="preserve">[SCREENSHOT MISSING — insert manually]</w:t>
-      </w:r>
-    </w:p>
-    <w:p>
-      <w:pPr>
-        <w:pStyle w:val="Heading2"/>
-        <w:spacing w:after="120" w:before="300"/>
-      </w:pPr>
-      <w:r>
-        <w:rPr>
-          <w:rFonts w:ascii="Times New Roman" w:cs="Times New Roman" w:eastAsia="Times New Roman" w:hAnsi="Times New Roman"/>
-          <w:b/>
-          <w:bCs/>
-        </w:rPr>
-        <w:t xml:space="preserve">Profile Settings</w:t>
-      </w:r>
-    </w:p>
-    <w:p>
-      <w:pPr>
-        <w:spacing w:after="200" w:line="276"/>
-        <w:jc w:val="both"/>
-      </w:pPr>
-      <w:r>
-        <w:rPr>
-          <w:rFonts w:ascii="Times New Roman" w:cs="Times New Roman" w:eastAsia="Times New Roman" w:hAnsi="Times New Roman"/>
-          <w:sz w:val="24"/>
-          <w:szCs w:val="24"/>
-        </w:rPr>
-        <w:t xml:space="preserve">Standard account-management page available to every authenticated user, regardless of role.</w:t>
-      </w:r>
-    </w:p>
-    <w:p>
-      <w:pPr>
-        <w:pStyle w:val="ListParagraph"/>
-        <w:numPr>
-          <w:ilvl w:val="0"/>
-          <w:numId w:val="1"/>
-        </w:numPr>
-        <w:spacing w:after="80"/>
-      </w:pPr>
-      <w:r>
-        <w:rPr>
-          <w:rFonts w:ascii="Times New Roman" w:cs="Times New Roman" w:eastAsia="Times New Roman" w:hAnsi="Times New Roman"/>
-          <w:sz w:val="24"/>
-          <w:szCs w:val="24"/>
-        </w:rPr>
-        <w:t xml:space="preserve">Update name and email address</w:t>
-      </w:r>
-    </w:p>
-    <w:p>
-      <w:pPr>
-        <w:pStyle w:val="ListParagraph"/>
-        <w:numPr>
-          <w:ilvl w:val="0"/>
-          <w:numId w:val="1"/>
-        </w:numPr>
-        <w:spacing w:after="80"/>
-      </w:pPr>
-      <w:r>
-        <w:rPr>
-          <w:rFonts w:ascii="Times New Roman" w:cs="Times New Roman" w:eastAsia="Times New Roman" w:hAnsi="Times New Roman"/>
-          <w:sz w:val="24"/>
-          <w:szCs w:val="24"/>
-        </w:rPr>
-        <w:t xml:space="preserve">Change password</w:t>
-      </w:r>
-    </w:p>
-    <w:p>
-      <w:pPr>
-        <w:pStyle w:val="ListParagraph"/>
-        <w:numPr>
-          <w:ilvl w:val="0"/>
-          <w:numId w:val="1"/>
-        </w:numPr>
-        <w:spacing w:after="80"/>
-      </w:pPr>
-      <w:r>
-        <w:rPr>
-          <w:rFonts w:ascii="Times New Roman" w:cs="Times New Roman" w:eastAsia="Times New Roman" w:hAnsi="Times New Roman"/>
-          <w:sz w:val="24"/>
-          <w:szCs w:val="24"/>
-        </w:rPr>
-        <w:t xml:space="preserve">Delete account (with confirmation)</w:t>
+        <w:t xml:space="preserve">Lists all doctors with specialization and working hours, for Admin management.</w:t>
+      </w:r>
+    </w:p>
+    <w:p>
+      <w:pPr>
+        <w:pStyle w:val="ListParagraph"/>
+        <w:numPr>
+          <w:ilvl w:val="0"/>
+          <w:numId w:val="1"/>
+        </w:numPr>
+        <w:spacing w:after="80"/>
+      </w:pPr>
+      <w:r>
+        <w:rPr>
+          <w:rFonts w:ascii="Times New Roman" w:cs="Times New Roman" w:eastAsia="Times New Roman" w:hAnsi="Times New Roman"/>
+          <w:sz w:val="24"/>
+          <w:szCs w:val="24"/>
+        </w:rPr>
+        <w:t xml:space="preserve">Paginated table: name, specialization, working hours, contact</w:t>
+      </w:r>
+    </w:p>
+    <w:p>
+      <w:pPr>
+        <w:pStyle w:val="ListParagraph"/>
+        <w:numPr>
+          <w:ilvl w:val="0"/>
+          <w:numId w:val="1"/>
+        </w:numPr>
+        <w:spacing w:after="80"/>
+      </w:pPr>
+      <w:r>
+        <w:rPr>
+          <w:rFonts w:ascii="Times New Roman" w:cs="Times New Roman" w:eastAsia="Times New Roman" w:hAnsi="Times New Roman"/>
+          <w:sz w:val="24"/>
+          <w:szCs w:val="24"/>
+        </w:rPr>
+        <w:t xml:space="preserve">View and edit action icons per row</w:t>
+      </w:r>
+    </w:p>
+    <w:p>
+      <w:pPr>
+        <w:pStyle w:val="ListParagraph"/>
+        <w:numPr>
+          <w:ilvl w:val="0"/>
+          <w:numId w:val="1"/>
+        </w:numPr>
+        <w:spacing w:after="80"/>
+      </w:pPr>
+      <w:r>
+        <w:rPr>
+          <w:rFonts w:ascii="Times New Roman" w:cs="Times New Roman" w:eastAsia="Times New Roman" w:hAnsi="Times New Roman"/>
+          <w:sz w:val="24"/>
+          <w:szCs w:val="24"/>
+        </w:rPr>
+        <w:t xml:space="preserve">"Add New Doctor" call-to-action</w:t>
       </w:r>
     </w:p>
     <w:p>
@@ -2825,6 +1929,1490 @@
     </w:p>
     <w:p>
       <w:pPr>
+        <w:pStyle w:val="Heading2"/>
+        <w:spacing w:after="120" w:before="300"/>
+      </w:pPr>
+      <w:r>
+        <w:rPr>
+          <w:rFonts w:ascii="Times New Roman" w:cs="Times New Roman" w:eastAsia="Times New Roman" w:hAnsi="Times New Roman"/>
+          <w:b/>
+          <w:bCs/>
+        </w:rPr>
+        <w:t xml:space="preserve">Add Doctor</w:t>
+      </w:r>
+    </w:p>
+    <w:p>
+      <w:pPr>
+        <w:spacing w:after="200" w:line="276"/>
+        <w:jc w:val="both"/>
+      </w:pPr>
+      <w:r>
+        <w:rPr>
+          <w:rFonts w:ascii="Times New Roman" w:cs="Times New Roman" w:eastAsia="Times New Roman" w:hAnsi="Times New Roman"/>
+          <w:sz w:val="24"/>
+          <w:szCs w:val="24"/>
+        </w:rPr>
+        <w:t xml:space="preserve">Form to register a new doctor.</w:t>
+      </w:r>
+    </w:p>
+    <w:p>
+      <w:pPr>
+        <w:pStyle w:val="ListParagraph"/>
+        <w:numPr>
+          <w:ilvl w:val="0"/>
+          <w:numId w:val="1"/>
+        </w:numPr>
+        <w:spacing w:after="80"/>
+      </w:pPr>
+      <w:r>
+        <w:rPr>
+          <w:rFonts w:ascii="Times New Roman" w:cs="Times New Roman" w:eastAsia="Times New Roman" w:hAnsi="Times New Roman"/>
+          <w:sz w:val="24"/>
+          <w:szCs w:val="24"/>
+        </w:rPr>
+        <w:t xml:space="preserve">Name, specialization, contact and working-hours fields with validation</w:t>
+      </w:r>
+    </w:p>
+    <w:p>
+      <w:pPr>
+        <w:spacing w:after="300" w:before="120"/>
+        <w:jc w:val="center"/>
+      </w:pPr>
+      <w:r>
+        <w:drawing>
+          <wp:inline distT="0" distB="0" distL="0" distR="0">
+            <wp:extent cx="5524500" cy="3105150"/>
+            <wp:effectExtent t="0" r="0" b="0" l="0"/>
+            <wp:docPr id="1" name="" descr="" title=""/>
+            <wp:cNvGraphicFramePr>
+              <a:graphicFrameLocks xmlns:a="http://schemas.openxmlformats.org/drawingml/2006/main" noChangeAspect="1"/>
+            </wp:cNvGraphicFramePr>
+            <a:graphic xmlns:a="http://schemas.openxmlformats.org/drawingml/2006/main">
+              <a:graphicData uri="http://schemas.openxmlformats.org/drawingml/2006/picture">
+                <pic:pic xmlns:pic="http://schemas.openxmlformats.org/drawingml/2006/picture">
+                  <pic:nvPicPr>
+                    <pic:cNvPr id="0" name="" descr=""/>
+                    <pic:cNvPicPr>
+                      <a:picLocks noChangeAspect="1" noChangeArrowheads="1"/>
+                    </pic:cNvPicPr>
+                  </pic:nvPicPr>
+                  <pic:blipFill>
+                    <a:blip r:embed="rId20" cstate="none"/>
+                    <a:srcRect/>
+                    <a:stretch>
+                      <a:fillRect/>
+                    </a:stretch>
+                  </pic:blipFill>
+                  <pic:spPr bwMode="auto">
+                    <a:xfrm>
+                      <a:off x="0" y="0"/>
+                      <a:ext cx="5524500" cy="3105150"/>
+                    </a:xfrm>
+                    <a:prstGeom prst="rect">
+                      <a:avLst/>
+                    </a:prstGeom>
+                  </pic:spPr>
+                </pic:pic>
+              </a:graphicData>
+            </a:graphic>
+          </wp:inline>
+        </w:drawing>
+      </w:r>
+    </w:p>
+    <w:p>
+      <w:pPr>
+        <w:pStyle w:val="Heading2"/>
+        <w:spacing w:after="120" w:before="300"/>
+      </w:pPr>
+      <w:r>
+        <w:rPr>
+          <w:rFonts w:ascii="Times New Roman" w:cs="Times New Roman" w:eastAsia="Times New Roman" w:hAnsi="Times New Roman"/>
+          <w:b/>
+          <w:bCs/>
+        </w:rPr>
+        <w:t xml:space="preserve">Doctor Profile</w:t>
+      </w:r>
+    </w:p>
+    <w:p>
+      <w:pPr>
+        <w:spacing w:after="200" w:line="276"/>
+        <w:jc w:val="both"/>
+      </w:pPr>
+      <w:r>
+        <w:rPr>
+          <w:rFonts w:ascii="Times New Roman" w:cs="Times New Roman" w:eastAsia="Times New Roman" w:hAnsi="Times New Roman"/>
+          <w:sz w:val="24"/>
+          <w:szCs w:val="24"/>
+        </w:rPr>
+        <w:t xml:space="preserve">Shows a single doctor's details together with their appointment history.</w:t>
+      </w:r>
+    </w:p>
+    <w:p>
+      <w:pPr>
+        <w:pStyle w:val="ListParagraph"/>
+        <w:numPr>
+          <w:ilvl w:val="0"/>
+          <w:numId w:val="1"/>
+        </w:numPr>
+        <w:spacing w:after="80"/>
+      </w:pPr>
+      <w:r>
+        <w:rPr>
+          <w:rFonts w:ascii="Times New Roman" w:cs="Times New Roman" w:eastAsia="Times New Roman" w:hAnsi="Times New Roman"/>
+          <w:sz w:val="24"/>
+          <w:szCs w:val="24"/>
+        </w:rPr>
+        <w:t xml:space="preserve">Specialization, contact and working hours</w:t>
+      </w:r>
+    </w:p>
+    <w:p>
+      <w:pPr>
+        <w:pStyle w:val="ListParagraph"/>
+        <w:numPr>
+          <w:ilvl w:val="0"/>
+          <w:numId w:val="1"/>
+        </w:numPr>
+        <w:spacing w:after="80"/>
+      </w:pPr>
+      <w:r>
+        <w:rPr>
+          <w:rFonts w:ascii="Times New Roman" w:cs="Times New Roman" w:eastAsia="Times New Roman" w:hAnsi="Times New Roman"/>
+          <w:sz w:val="24"/>
+          <w:szCs w:val="24"/>
+        </w:rPr>
+        <w:t xml:space="preserve">List of the doctor's appointments</w:t>
+      </w:r>
+    </w:p>
+    <w:p>
+      <w:pPr>
+        <w:spacing w:after="300" w:before="120"/>
+        <w:jc w:val="center"/>
+      </w:pPr>
+      <w:r>
+        <w:drawing>
+          <wp:inline distT="0" distB="0" distL="0" distR="0">
+            <wp:extent cx="5524500" cy="3124200"/>
+            <wp:effectExtent t="0" r="0" b="0" l="0"/>
+            <wp:docPr id="1" name="" descr="" title=""/>
+            <wp:cNvGraphicFramePr>
+              <a:graphicFrameLocks xmlns:a="http://schemas.openxmlformats.org/drawingml/2006/main" noChangeAspect="1"/>
+            </wp:cNvGraphicFramePr>
+            <a:graphic xmlns:a="http://schemas.openxmlformats.org/drawingml/2006/main">
+              <a:graphicData uri="http://schemas.openxmlformats.org/drawingml/2006/picture">
+                <pic:pic xmlns:pic="http://schemas.openxmlformats.org/drawingml/2006/picture">
+                  <pic:nvPicPr>
+                    <pic:cNvPr id="0" name="" descr=""/>
+                    <pic:cNvPicPr>
+                      <a:picLocks noChangeAspect="1" noChangeArrowheads="1"/>
+                    </pic:cNvPicPr>
+                  </pic:nvPicPr>
+                  <pic:blipFill>
+                    <a:blip r:embed="rId21" cstate="none"/>
+                    <a:srcRect/>
+                    <a:stretch>
+                      <a:fillRect/>
+                    </a:stretch>
+                  </pic:blipFill>
+                  <pic:spPr bwMode="auto">
+                    <a:xfrm>
+                      <a:off x="0" y="0"/>
+                      <a:ext cx="5524500" cy="3124200"/>
+                    </a:xfrm>
+                    <a:prstGeom prst="rect">
+                      <a:avLst/>
+                    </a:prstGeom>
+                  </pic:spPr>
+                </pic:pic>
+              </a:graphicData>
+            </a:graphic>
+          </wp:inline>
+        </w:drawing>
+      </w:r>
+    </w:p>
+    <w:p>
+      <w:pPr>
+        <w:pStyle w:val="Heading2"/>
+        <w:spacing w:after="120" w:before="300"/>
+      </w:pPr>
+      <w:r>
+        <w:rPr>
+          <w:rFonts w:ascii="Times New Roman" w:cs="Times New Roman" w:eastAsia="Times New Roman" w:hAnsi="Times New Roman"/>
+          <w:b/>
+          <w:bCs/>
+        </w:rPr>
+        <w:t xml:space="preserve">Edit Doctor</w:t>
+      </w:r>
+    </w:p>
+    <w:p>
+      <w:pPr>
+        <w:spacing w:after="200" w:line="276"/>
+        <w:jc w:val="both"/>
+      </w:pPr>
+      <w:r>
+        <w:rPr>
+          <w:rFonts w:ascii="Times New Roman" w:cs="Times New Roman" w:eastAsia="Times New Roman" w:hAnsi="Times New Roman"/>
+          <w:sz w:val="24"/>
+          <w:szCs w:val="24"/>
+        </w:rPr>
+        <w:t xml:space="preserve">Form to update an existing doctor's details.</w:t>
+      </w:r>
+    </w:p>
+    <w:p>
+      <w:pPr>
+        <w:pStyle w:val="ListParagraph"/>
+        <w:numPr>
+          <w:ilvl w:val="0"/>
+          <w:numId w:val="1"/>
+        </w:numPr>
+        <w:spacing w:after="80"/>
+      </w:pPr>
+      <w:r>
+        <w:rPr>
+          <w:rFonts w:ascii="Times New Roman" w:cs="Times New Roman" w:eastAsia="Times New Roman" w:hAnsi="Times New Roman"/>
+          <w:sz w:val="24"/>
+          <w:szCs w:val="24"/>
+        </w:rPr>
+        <w:t xml:space="preserve">Same fields as doctor registration, pre-populated from the existing record</w:t>
+      </w:r>
+    </w:p>
+    <w:p>
+      <w:pPr>
+        <w:spacing w:after="300" w:before="120"/>
+        <w:jc w:val="center"/>
+      </w:pPr>
+      <w:r>
+        <w:drawing>
+          <wp:inline distT="0" distB="0" distL="0" distR="0">
+            <wp:extent cx="5524500" cy="3105150"/>
+            <wp:effectExtent t="0" r="0" b="0" l="0"/>
+            <wp:docPr id="1" name="" descr="" title=""/>
+            <wp:cNvGraphicFramePr>
+              <a:graphicFrameLocks xmlns:a="http://schemas.openxmlformats.org/drawingml/2006/main" noChangeAspect="1"/>
+            </wp:cNvGraphicFramePr>
+            <a:graphic xmlns:a="http://schemas.openxmlformats.org/drawingml/2006/main">
+              <a:graphicData uri="http://schemas.openxmlformats.org/drawingml/2006/picture">
+                <pic:pic xmlns:pic="http://schemas.openxmlformats.org/drawingml/2006/picture">
+                  <pic:nvPicPr>
+                    <pic:cNvPr id="0" name="" descr=""/>
+                    <pic:cNvPicPr>
+                      <a:picLocks noChangeAspect="1" noChangeArrowheads="1"/>
+                    </pic:cNvPicPr>
+                  </pic:nvPicPr>
+                  <pic:blipFill>
+                    <a:blip r:embed="rId22" cstate="none"/>
+                    <a:srcRect/>
+                    <a:stretch>
+                      <a:fillRect/>
+                    </a:stretch>
+                  </pic:blipFill>
+                  <pic:spPr bwMode="auto">
+                    <a:xfrm>
+                      <a:off x="0" y="0"/>
+                      <a:ext cx="5524500" cy="3105150"/>
+                    </a:xfrm>
+                    <a:prstGeom prst="rect">
+                      <a:avLst/>
+                    </a:prstGeom>
+                  </pic:spPr>
+                </pic:pic>
+              </a:graphicData>
+            </a:graphic>
+          </wp:inline>
+        </w:drawing>
+      </w:r>
+    </w:p>
+    <w:p>
+      <w:pPr>
+        <w:pStyle w:val="Heading2"/>
+        <w:spacing w:after="120" w:before="300"/>
+      </w:pPr>
+      <w:r>
+        <w:rPr>
+          <w:rFonts w:ascii="Times New Roman" w:cs="Times New Roman" w:eastAsia="Times New Roman" w:hAnsi="Times New Roman"/>
+          <w:b/>
+          <w:bCs/>
+        </w:rPr>
+        <w:t xml:space="preserve">Book New Appointment</w:t>
+      </w:r>
+    </w:p>
+    <w:p>
+      <w:pPr>
+        <w:spacing w:after="200" w:line="276"/>
+        <w:jc w:val="both"/>
+      </w:pPr>
+      <w:r>
+        <w:rPr>
+          <w:rFonts w:ascii="Times New Roman" w:cs="Times New Roman" w:eastAsia="Times New Roman" w:hAnsi="Times New Roman"/>
+          <w:sz w:val="24"/>
+          <w:szCs w:val="24"/>
+        </w:rPr>
+        <w:t xml:space="preserve">Interactive scheduler used by Admin and Receptionist to book a patient with a doctor.</w:t>
+      </w:r>
+    </w:p>
+    <w:p>
+      <w:pPr>
+        <w:pStyle w:val="ListParagraph"/>
+        <w:numPr>
+          <w:ilvl w:val="0"/>
+          <w:numId w:val="1"/>
+        </w:numPr>
+        <w:spacing w:after="80"/>
+      </w:pPr>
+      <w:r>
+        <w:rPr>
+          <w:rFonts w:ascii="Times New Roman" w:cs="Times New Roman" w:eastAsia="Times New Roman" w:hAnsi="Times New Roman"/>
+          <w:sz w:val="24"/>
+          <w:szCs w:val="24"/>
+        </w:rPr>
+        <w:t xml:space="preserve">14-day rolling date picker</w:t>
+      </w:r>
+    </w:p>
+    <w:p>
+      <w:pPr>
+        <w:pStyle w:val="ListParagraph"/>
+        <w:numPr>
+          <w:ilvl w:val="0"/>
+          <w:numId w:val="1"/>
+        </w:numPr>
+        <w:spacing w:after="80"/>
+      </w:pPr>
+      <w:r>
+        <w:rPr>
+          <w:rFonts w:ascii="Times New Roman" w:cs="Times New Roman" w:eastAsia="Times New Roman" w:hAnsi="Times New Roman"/>
+          <w:sz w:val="24"/>
+          <w:szCs w:val="24"/>
+        </w:rPr>
+        <w:t xml:space="preserve">Morning and afternoon time-slot grid showing live availability</w:t>
+      </w:r>
+    </w:p>
+    <w:p>
+      <w:pPr>
+        <w:pStyle w:val="ListParagraph"/>
+        <w:numPr>
+          <w:ilvl w:val="0"/>
+          <w:numId w:val="1"/>
+        </w:numPr>
+        <w:spacing w:after="80"/>
+      </w:pPr>
+      <w:r>
+        <w:rPr>
+          <w:rFonts w:ascii="Times New Roman" w:cs="Times New Roman" w:eastAsia="Times New Roman" w:hAnsi="Times New Roman"/>
+          <w:sz w:val="24"/>
+          <w:szCs w:val="24"/>
+        </w:rPr>
+        <w:t xml:space="preserve">Patient and doctor selection</w:t>
+      </w:r>
+    </w:p>
+    <w:p>
+      <w:pPr>
+        <w:pStyle w:val="ListParagraph"/>
+        <w:numPr>
+          <w:ilvl w:val="0"/>
+          <w:numId w:val="1"/>
+        </w:numPr>
+        <w:spacing w:after="80"/>
+      </w:pPr>
+      <w:r>
+        <w:rPr>
+          <w:rFonts w:ascii="Times New Roman" w:cs="Times New Roman" w:eastAsia="Times New Roman" w:hAnsi="Times New Roman"/>
+          <w:sz w:val="24"/>
+          <w:szCs w:val="24"/>
+        </w:rPr>
+        <w:t xml:space="preserve">AJAX conflict check against existing bookings before submission</w:t>
+      </w:r>
+    </w:p>
+    <w:p>
+      <w:pPr>
+        <w:spacing w:after="300" w:before="120"/>
+        <w:jc w:val="center"/>
+      </w:pPr>
+      <w:r>
+        <w:drawing>
+          <wp:inline distT="0" distB="0" distL="0" distR="0">
+            <wp:extent cx="5524500" cy="3933825"/>
+            <wp:effectExtent t="0" r="0" b="0" l="0"/>
+            <wp:docPr id="1" name="" descr="" title=""/>
+            <wp:cNvGraphicFramePr>
+              <a:graphicFrameLocks xmlns:a="http://schemas.openxmlformats.org/drawingml/2006/main" noChangeAspect="1"/>
+            </wp:cNvGraphicFramePr>
+            <a:graphic xmlns:a="http://schemas.openxmlformats.org/drawingml/2006/main">
+              <a:graphicData uri="http://schemas.openxmlformats.org/drawingml/2006/picture">
+                <pic:pic xmlns:pic="http://schemas.openxmlformats.org/drawingml/2006/picture">
+                  <pic:nvPicPr>
+                    <pic:cNvPr id="0" name="" descr=""/>
+                    <pic:cNvPicPr>
+                      <a:picLocks noChangeAspect="1" noChangeArrowheads="1"/>
+                    </pic:cNvPicPr>
+                  </pic:nvPicPr>
+                  <pic:blipFill>
+                    <a:blip r:embed="rId23" cstate="none"/>
+                    <a:srcRect/>
+                    <a:stretch>
+                      <a:fillRect/>
+                    </a:stretch>
+                  </pic:blipFill>
+                  <pic:spPr bwMode="auto">
+                    <a:xfrm>
+                      <a:off x="0" y="0"/>
+                      <a:ext cx="5524500" cy="3933825"/>
+                    </a:xfrm>
+                    <a:prstGeom prst="rect">
+                      <a:avLst/>
+                    </a:prstGeom>
+                  </pic:spPr>
+                </pic:pic>
+              </a:graphicData>
+            </a:graphic>
+          </wp:inline>
+        </w:drawing>
+      </w:r>
+    </w:p>
+    <w:p>
+      <w:pPr>
+        <w:pStyle w:val="Heading2"/>
+        <w:spacing w:after="120" w:before="300"/>
+      </w:pPr>
+      <w:r>
+        <w:rPr>
+          <w:rFonts w:ascii="Times New Roman" w:cs="Times New Roman" w:eastAsia="Times New Roman" w:hAnsi="Times New Roman"/>
+          <w:b/>
+          <w:bCs/>
+        </w:rPr>
+        <w:t xml:space="preserve">Appointments List</w:t>
+      </w:r>
+    </w:p>
+    <w:p>
+      <w:pPr>
+        <w:spacing w:after="200" w:line="276"/>
+        <w:jc w:val="both"/>
+      </w:pPr>
+      <w:r>
+        <w:rPr>
+          <w:rFonts w:ascii="Times New Roman" w:cs="Times New Roman" w:eastAsia="Times New Roman" w:hAnsi="Times New Roman"/>
+          <w:sz w:val="24"/>
+          <w:szCs w:val="24"/>
+        </w:rPr>
+        <w:t xml:space="preserve">Lists appointments, filtered by role: all appointments for Admin/Receptionist, own appointments only for Doctor.</w:t>
+      </w:r>
+    </w:p>
+    <w:p>
+      <w:pPr>
+        <w:pStyle w:val="ListParagraph"/>
+        <w:numPr>
+          <w:ilvl w:val="0"/>
+          <w:numId w:val="1"/>
+        </w:numPr>
+        <w:spacing w:after="80"/>
+      </w:pPr>
+      <w:r>
+        <w:rPr>
+          <w:rFonts w:ascii="Times New Roman" w:cs="Times New Roman" w:eastAsia="Times New Roman" w:hAnsi="Times New Roman"/>
+          <w:sz w:val="24"/>
+          <w:szCs w:val="24"/>
+        </w:rPr>
+        <w:t xml:space="preserve">Paginated table: date/time, patient, doctor, reason, status</w:t>
+      </w:r>
+    </w:p>
+    <w:p>
+      <w:pPr>
+        <w:pStyle w:val="ListParagraph"/>
+        <w:numPr>
+          <w:ilvl w:val="0"/>
+          <w:numId w:val="1"/>
+        </w:numPr>
+        <w:spacing w:after="80"/>
+      </w:pPr>
+      <w:r>
+        <w:rPr>
+          <w:rFonts w:ascii="Times New Roman" w:cs="Times New Roman" w:eastAsia="Times New Roman" w:hAnsi="Times New Roman"/>
+          <w:sz w:val="24"/>
+          <w:szCs w:val="24"/>
+        </w:rPr>
+        <w:t xml:space="preserve">View action for every role; edit action for Admin/Receptionist only</w:t>
+      </w:r>
+    </w:p>
+    <w:p>
+      <w:pPr>
+        <w:pStyle w:val="ListParagraph"/>
+        <w:numPr>
+          <w:ilvl w:val="0"/>
+          <w:numId w:val="1"/>
+        </w:numPr>
+        <w:spacing w:after="80"/>
+      </w:pPr>
+      <w:r>
+        <w:rPr>
+          <w:rFonts w:ascii="Times New Roman" w:cs="Times New Roman" w:eastAsia="Times New Roman" w:hAnsi="Times New Roman"/>
+          <w:sz w:val="24"/>
+          <w:szCs w:val="24"/>
+        </w:rPr>
+        <w:t xml:space="preserve">"Book Appointment" call-to-action for Admin/Receptionist</w:t>
+      </w:r>
+    </w:p>
+    <w:p>
+      <w:pPr>
+        <w:spacing w:after="300" w:before="120"/>
+        <w:jc w:val="center"/>
+      </w:pPr>
+      <w:r>
+        <w:drawing>
+          <wp:inline distT="0" distB="0" distL="0" distR="0">
+            <wp:extent cx="5524500" cy="3105150"/>
+            <wp:effectExtent t="0" r="0" b="0" l="0"/>
+            <wp:docPr id="1" name="" descr="" title=""/>
+            <wp:cNvGraphicFramePr>
+              <a:graphicFrameLocks xmlns:a="http://schemas.openxmlformats.org/drawingml/2006/main" noChangeAspect="1"/>
+            </wp:cNvGraphicFramePr>
+            <a:graphic xmlns:a="http://schemas.openxmlformats.org/drawingml/2006/main">
+              <a:graphicData uri="http://schemas.openxmlformats.org/drawingml/2006/picture">
+                <pic:pic xmlns:pic="http://schemas.openxmlformats.org/drawingml/2006/picture">
+                  <pic:nvPicPr>
+                    <pic:cNvPr id="0" name="" descr=""/>
+                    <pic:cNvPicPr>
+                      <a:picLocks noChangeAspect="1" noChangeArrowheads="1"/>
+                    </pic:cNvPicPr>
+                  </pic:nvPicPr>
+                  <pic:blipFill>
+                    <a:blip r:embed="rId24" cstate="none"/>
+                    <a:srcRect/>
+                    <a:stretch>
+                      <a:fillRect/>
+                    </a:stretch>
+                  </pic:blipFill>
+                  <pic:spPr bwMode="auto">
+                    <a:xfrm>
+                      <a:off x="0" y="0"/>
+                      <a:ext cx="5524500" cy="3105150"/>
+                    </a:xfrm>
+                    <a:prstGeom prst="rect">
+                      <a:avLst/>
+                    </a:prstGeom>
+                  </pic:spPr>
+                </pic:pic>
+              </a:graphicData>
+            </a:graphic>
+          </wp:inline>
+        </w:drawing>
+      </w:r>
+    </w:p>
+    <w:p>
+      <w:pPr>
+        <w:pStyle w:val="Heading2"/>
+        <w:spacing w:after="120" w:before="300"/>
+      </w:pPr>
+      <w:r>
+        <w:rPr>
+          <w:rFonts w:ascii="Times New Roman" w:cs="Times New Roman" w:eastAsia="Times New Roman" w:hAnsi="Times New Roman"/>
+          <w:b/>
+          <w:bCs/>
+        </w:rPr>
+        <w:t xml:space="preserve">Appointment Details</w:t>
+      </w:r>
+    </w:p>
+    <w:p>
+      <w:pPr>
+        <w:spacing w:after="200" w:line="276"/>
+        <w:jc w:val="both"/>
+      </w:pPr>
+      <w:r>
+        <w:rPr>
+          <w:rFonts w:ascii="Times New Roman" w:cs="Times New Roman" w:eastAsia="Times New Roman" w:hAnsi="Times New Roman"/>
+          <w:sz w:val="24"/>
+          <w:szCs w:val="24"/>
+        </w:rPr>
+        <w:t xml:space="preserve">Shows a single appointment with its linked patient, doctor and billing record.</w:t>
+      </w:r>
+    </w:p>
+    <w:p>
+      <w:pPr>
+        <w:pStyle w:val="ListParagraph"/>
+        <w:numPr>
+          <w:ilvl w:val="0"/>
+          <w:numId w:val="1"/>
+        </w:numPr>
+        <w:spacing w:after="80"/>
+      </w:pPr>
+      <w:r>
+        <w:rPr>
+          <w:rFonts w:ascii="Times New Roman" w:cs="Times New Roman" w:eastAsia="Times New Roman" w:hAnsi="Times New Roman"/>
+          <w:sz w:val="24"/>
+          <w:szCs w:val="24"/>
+        </w:rPr>
+        <w:t xml:space="preserve">Full appointment metadata plus any linked invoice</w:t>
+      </w:r>
+    </w:p>
+    <w:p>
+      <w:pPr>
+        <w:spacing w:after="300" w:before="120"/>
+        <w:jc w:val="center"/>
+      </w:pPr>
+      <w:r>
+        <w:drawing>
+          <wp:inline distT="0" distB="0" distL="0" distR="0">
+            <wp:extent cx="5524500" cy="3105150"/>
+            <wp:effectExtent t="0" r="0" b="0" l="0"/>
+            <wp:docPr id="1" name="" descr="" title=""/>
+            <wp:cNvGraphicFramePr>
+              <a:graphicFrameLocks xmlns:a="http://schemas.openxmlformats.org/drawingml/2006/main" noChangeAspect="1"/>
+            </wp:cNvGraphicFramePr>
+            <a:graphic xmlns:a="http://schemas.openxmlformats.org/drawingml/2006/main">
+              <a:graphicData uri="http://schemas.openxmlformats.org/drawingml/2006/picture">
+                <pic:pic xmlns:pic="http://schemas.openxmlformats.org/drawingml/2006/picture">
+                  <pic:nvPicPr>
+                    <pic:cNvPr id="0" name="" descr=""/>
+                    <pic:cNvPicPr>
+                      <a:picLocks noChangeAspect="1" noChangeArrowheads="1"/>
+                    </pic:cNvPicPr>
+                  </pic:nvPicPr>
+                  <pic:blipFill>
+                    <a:blip r:embed="rId25" cstate="none"/>
+                    <a:srcRect/>
+                    <a:stretch>
+                      <a:fillRect/>
+                    </a:stretch>
+                  </pic:blipFill>
+                  <pic:spPr bwMode="auto">
+                    <a:xfrm>
+                      <a:off x="0" y="0"/>
+                      <a:ext cx="5524500" cy="3105150"/>
+                    </a:xfrm>
+                    <a:prstGeom prst="rect">
+                      <a:avLst/>
+                    </a:prstGeom>
+                  </pic:spPr>
+                </pic:pic>
+              </a:graphicData>
+            </a:graphic>
+          </wp:inline>
+        </w:drawing>
+      </w:r>
+    </w:p>
+    <w:p>
+      <w:pPr>
+        <w:pStyle w:val="Heading2"/>
+        <w:spacing w:after="120" w:before="300"/>
+      </w:pPr>
+      <w:r>
+        <w:rPr>
+          <w:rFonts w:ascii="Times New Roman" w:cs="Times New Roman" w:eastAsia="Times New Roman" w:hAnsi="Times New Roman"/>
+          <w:b/>
+          <w:bCs/>
+        </w:rPr>
+        <w:t xml:space="preserve">Edit Appointment</w:t>
+      </w:r>
+    </w:p>
+    <w:p>
+      <w:pPr>
+        <w:spacing w:after="200" w:line="276"/>
+        <w:jc w:val="both"/>
+      </w:pPr>
+      <w:r>
+        <w:rPr>
+          <w:rFonts w:ascii="Times New Roman" w:cs="Times New Roman" w:eastAsia="Times New Roman" w:hAnsi="Times New Roman"/>
+          <w:sz w:val="24"/>
+          <w:szCs w:val="24"/>
+        </w:rPr>
+        <w:t xml:space="preserve">Form to reschedule or update an existing appointment, with the same availability check used on creation.</w:t>
+      </w:r>
+    </w:p>
+    <w:p>
+      <w:pPr>
+        <w:pStyle w:val="ListParagraph"/>
+        <w:numPr>
+          <w:ilvl w:val="0"/>
+          <w:numId w:val="1"/>
+        </w:numPr>
+        <w:spacing w:after="80"/>
+      </w:pPr>
+      <w:r>
+        <w:rPr>
+          <w:rFonts w:ascii="Times New Roman" w:cs="Times New Roman" w:eastAsia="Times New Roman" w:hAnsi="Times New Roman"/>
+          <w:sz w:val="24"/>
+          <w:szCs w:val="24"/>
+        </w:rPr>
+        <w:t xml:space="preserve">Patient/doctor/date/time fields pre-filled</w:t>
+      </w:r>
+    </w:p>
+    <w:p>
+      <w:pPr>
+        <w:pStyle w:val="ListParagraph"/>
+        <w:numPr>
+          <w:ilvl w:val="0"/>
+          <w:numId w:val="1"/>
+        </w:numPr>
+        <w:spacing w:after="80"/>
+      </w:pPr>
+      <w:r>
+        <w:rPr>
+          <w:rFonts w:ascii="Times New Roman" w:cs="Times New Roman" w:eastAsia="Times New Roman" w:hAnsi="Times New Roman"/>
+          <w:sz w:val="24"/>
+          <w:szCs w:val="24"/>
+        </w:rPr>
+        <w:t xml:space="preserve">Conflict check re-run if the date, time or doctor changes</w:t>
+      </w:r>
+    </w:p>
+    <w:p>
+      <w:pPr>
+        <w:spacing w:after="300" w:before="120"/>
+        <w:jc w:val="center"/>
+      </w:pPr>
+      <w:r>
+        <w:drawing>
+          <wp:inline distT="0" distB="0" distL="0" distR="0">
+            <wp:extent cx="5524500" cy="3600450"/>
+            <wp:effectExtent t="0" r="0" b="0" l="0"/>
+            <wp:docPr id="1" name="" descr="" title=""/>
+            <wp:cNvGraphicFramePr>
+              <a:graphicFrameLocks xmlns:a="http://schemas.openxmlformats.org/drawingml/2006/main" noChangeAspect="1"/>
+            </wp:cNvGraphicFramePr>
+            <a:graphic xmlns:a="http://schemas.openxmlformats.org/drawingml/2006/main">
+              <a:graphicData uri="http://schemas.openxmlformats.org/drawingml/2006/picture">
+                <pic:pic xmlns:pic="http://schemas.openxmlformats.org/drawingml/2006/picture">
+                  <pic:nvPicPr>
+                    <pic:cNvPr id="0" name="" descr=""/>
+                    <pic:cNvPicPr>
+                      <a:picLocks noChangeAspect="1" noChangeArrowheads="1"/>
+                    </pic:cNvPicPr>
+                  </pic:nvPicPr>
+                  <pic:blipFill>
+                    <a:blip r:embed="rId26" cstate="none"/>
+                    <a:srcRect/>
+                    <a:stretch>
+                      <a:fillRect/>
+                    </a:stretch>
+                  </pic:blipFill>
+                  <pic:spPr bwMode="auto">
+                    <a:xfrm>
+                      <a:off x="0" y="0"/>
+                      <a:ext cx="5524500" cy="3600450"/>
+                    </a:xfrm>
+                    <a:prstGeom prst="rect">
+                      <a:avLst/>
+                    </a:prstGeom>
+                  </pic:spPr>
+                </pic:pic>
+              </a:graphicData>
+            </a:graphic>
+          </wp:inline>
+        </w:drawing>
+      </w:r>
+    </w:p>
+    <w:p>
+      <w:pPr>
+        <w:pStyle w:val="Heading2"/>
+        <w:spacing w:after="120" w:before="300"/>
+      </w:pPr>
+      <w:r>
+        <w:rPr>
+          <w:rFonts w:ascii="Times New Roman" w:cs="Times New Roman" w:eastAsia="Times New Roman" w:hAnsi="Times New Roman"/>
+          <w:b/>
+          <w:bCs/>
+        </w:rPr>
+        <w:t xml:space="preserve">Create Invoice</w:t>
+      </w:r>
+    </w:p>
+    <w:p>
+      <w:pPr>
+        <w:spacing w:after="200" w:line="276"/>
+        <w:jc w:val="both"/>
+      </w:pPr>
+      <w:r>
+        <w:rPr>
+          <w:rFonts w:ascii="Times New Roman" w:cs="Times New Roman" w:eastAsia="Times New Roman" w:hAnsi="Times New Roman"/>
+          <w:sz w:val="24"/>
+          <w:szCs w:val="24"/>
+        </w:rPr>
+        <w:t xml:space="preserve">Form used by Admin and Receptionist to generate a new patient invoice.</w:t>
+      </w:r>
+    </w:p>
+    <w:p>
+      <w:pPr>
+        <w:pStyle w:val="ListParagraph"/>
+        <w:numPr>
+          <w:ilvl w:val="0"/>
+          <w:numId w:val="1"/>
+        </w:numPr>
+        <w:spacing w:after="80"/>
+      </w:pPr>
+      <w:r>
+        <w:rPr>
+          <w:rFonts w:ascii="Times New Roman" w:cs="Times New Roman" w:eastAsia="Times New Roman" w:hAnsi="Times New Roman"/>
+          <w:sz w:val="24"/>
+          <w:szCs w:val="24"/>
+        </w:rPr>
+        <w:t xml:space="preserve">Patient and attending-physician selection</w:t>
+      </w:r>
+    </w:p>
+    <w:p>
+      <w:pPr>
+        <w:pStyle w:val="ListParagraph"/>
+        <w:numPr>
+          <w:ilvl w:val="0"/>
+          <w:numId w:val="1"/>
+        </w:numPr>
+        <w:spacing w:after="80"/>
+      </w:pPr>
+      <w:r>
+        <w:rPr>
+          <w:rFonts w:ascii="Times New Roman" w:cs="Times New Roman" w:eastAsia="Times New Roman" w:hAnsi="Times New Roman"/>
+          <w:sz w:val="24"/>
+          <w:szCs w:val="24"/>
+        </w:rPr>
+        <w:t xml:space="preserve">Payment method selection (card, cash, insurance, bank transfer)</w:t>
+      </w:r>
+    </w:p>
+    <w:p>
+      <w:pPr>
+        <w:pStyle w:val="ListParagraph"/>
+        <w:numPr>
+          <w:ilvl w:val="0"/>
+          <w:numId w:val="1"/>
+        </w:numPr>
+        <w:spacing w:after="80"/>
+      </w:pPr>
+      <w:r>
+        <w:rPr>
+          <w:rFonts w:ascii="Times New Roman" w:cs="Times New Roman" w:eastAsia="Times New Roman" w:hAnsi="Times New Roman"/>
+          <w:sz w:val="24"/>
+          <w:szCs w:val="24"/>
+        </w:rPr>
+        <w:t xml:space="preserve">Itemized service line items with running subtotal, tax, discount and total</w:t>
+      </w:r>
+    </w:p>
+    <w:p>
+      <w:pPr>
+        <w:pStyle w:val="ListParagraph"/>
+        <w:numPr>
+          <w:ilvl w:val="0"/>
+          <w:numId w:val="1"/>
+        </w:numPr>
+        <w:spacing w:after="80"/>
+      </w:pPr>
+      <w:r>
+        <w:rPr>
+          <w:rFonts w:ascii="Times New Roman" w:cs="Times New Roman" w:eastAsia="Times New Roman" w:hAnsi="Times New Roman"/>
+          <w:sz w:val="24"/>
+          <w:szCs w:val="24"/>
+        </w:rPr>
+        <w:t xml:space="preserve">"Finalize &amp; Print Invoice" and "Send to Insurance" actions</w:t>
+      </w:r>
+    </w:p>
+    <w:p>
+      <w:pPr>
+        <w:spacing w:after="300" w:before="120"/>
+        <w:jc w:val="center"/>
+      </w:pPr>
+      <w:r>
+        <w:drawing>
+          <wp:inline distT="0" distB="0" distL="0" distR="0">
+            <wp:extent cx="5524500" cy="3409950"/>
+            <wp:effectExtent t="0" r="0" b="0" l="0"/>
+            <wp:docPr id="1" name="" descr="" title=""/>
+            <wp:cNvGraphicFramePr>
+              <a:graphicFrameLocks xmlns:a="http://schemas.openxmlformats.org/drawingml/2006/main" noChangeAspect="1"/>
+            </wp:cNvGraphicFramePr>
+            <a:graphic xmlns:a="http://schemas.openxmlformats.org/drawingml/2006/main">
+              <a:graphicData uri="http://schemas.openxmlformats.org/drawingml/2006/picture">
+                <pic:pic xmlns:pic="http://schemas.openxmlformats.org/drawingml/2006/picture">
+                  <pic:nvPicPr>
+                    <pic:cNvPr id="0" name="" descr=""/>
+                    <pic:cNvPicPr>
+                      <a:picLocks noChangeAspect="1" noChangeArrowheads="1"/>
+                    </pic:cNvPicPr>
+                  </pic:nvPicPr>
+                  <pic:blipFill>
+                    <a:blip r:embed="rId27" cstate="none"/>
+                    <a:srcRect/>
+                    <a:stretch>
+                      <a:fillRect/>
+                    </a:stretch>
+                  </pic:blipFill>
+                  <pic:spPr bwMode="auto">
+                    <a:xfrm>
+                      <a:off x="0" y="0"/>
+                      <a:ext cx="5524500" cy="3409950"/>
+                    </a:xfrm>
+                    <a:prstGeom prst="rect">
+                      <a:avLst/>
+                    </a:prstGeom>
+                  </pic:spPr>
+                </pic:pic>
+              </a:graphicData>
+            </a:graphic>
+          </wp:inline>
+        </w:drawing>
+      </w:r>
+    </w:p>
+    <w:p>
+      <w:pPr>
+        <w:pStyle w:val="Heading2"/>
+        <w:spacing w:after="120" w:before="300"/>
+      </w:pPr>
+      <w:r>
+        <w:rPr>
+          <w:rFonts w:ascii="Times New Roman" w:cs="Times New Roman" w:eastAsia="Times New Roman" w:hAnsi="Times New Roman"/>
+          <w:b/>
+          <w:bCs/>
+        </w:rPr>
+        <w:t xml:space="preserve">Invoice List</w:t>
+      </w:r>
+    </w:p>
+    <w:p>
+      <w:pPr>
+        <w:spacing w:after="200" w:line="276"/>
+        <w:jc w:val="both"/>
+      </w:pPr>
+      <w:r>
+        <w:rPr>
+          <w:rFonts w:ascii="Times New Roman" w:cs="Times New Roman" w:eastAsia="Times New Roman" w:hAnsi="Times New Roman"/>
+          <w:sz w:val="24"/>
+          <w:szCs w:val="24"/>
+        </w:rPr>
+        <w:t xml:space="preserve">Lists all invoices with monthly revenue and pending-payment statistics.</w:t>
+      </w:r>
+    </w:p>
+    <w:p>
+      <w:pPr>
+        <w:pStyle w:val="ListParagraph"/>
+        <w:numPr>
+          <w:ilvl w:val="0"/>
+          <w:numId w:val="1"/>
+        </w:numPr>
+        <w:spacing w:after="80"/>
+      </w:pPr>
+      <w:r>
+        <w:rPr>
+          <w:rFonts w:ascii="Times New Roman" w:cs="Times New Roman" w:eastAsia="Times New Roman" w:hAnsi="Times New Roman"/>
+          <w:sz w:val="24"/>
+          <w:szCs w:val="24"/>
+        </w:rPr>
+        <w:t xml:space="preserve">Recent invoices table: invoice #, patient, date, amount, status</w:t>
+      </w:r>
+    </w:p>
+    <w:p>
+      <w:pPr>
+        <w:pStyle w:val="ListParagraph"/>
+        <w:numPr>
+          <w:ilvl w:val="0"/>
+          <w:numId w:val="1"/>
+        </w:numPr>
+        <w:spacing w:after="80"/>
+      </w:pPr>
+      <w:r>
+        <w:rPr>
+          <w:rFonts w:ascii="Times New Roman" w:cs="Times New Roman" w:eastAsia="Times New Roman" w:hAnsi="Times New Roman"/>
+          <w:sz w:val="24"/>
+          <w:szCs w:val="24"/>
+        </w:rPr>
+        <w:t xml:space="preserve">Monthly revenue card and pending-payments total</w:t>
+      </w:r>
+    </w:p>
+    <w:p>
+      <w:pPr>
+        <w:pStyle w:val="ListParagraph"/>
+        <w:numPr>
+          <w:ilvl w:val="0"/>
+          <w:numId w:val="1"/>
+        </w:numPr>
+        <w:spacing w:after="80"/>
+      </w:pPr>
+      <w:r>
+        <w:rPr>
+          <w:rFonts w:ascii="Times New Roman" w:cs="Times New Roman" w:eastAsia="Times New Roman" w:hAnsi="Times New Roman"/>
+          <w:sz w:val="24"/>
+          <w:szCs w:val="24"/>
+        </w:rPr>
+        <w:t xml:space="preserve">"Generate New Bill" call-to-action</w:t>
+      </w:r>
+    </w:p>
+    <w:p>
+      <w:pPr>
+        <w:spacing w:after="300" w:before="120"/>
+        <w:jc w:val="center"/>
+      </w:pPr>
+      <w:r>
+        <w:drawing>
+          <wp:inline distT="0" distB="0" distL="0" distR="0">
+            <wp:extent cx="5524500" cy="3971925"/>
+            <wp:effectExtent t="0" r="0" b="0" l="0"/>
+            <wp:docPr id="1" name="" descr="" title=""/>
+            <wp:cNvGraphicFramePr>
+              <a:graphicFrameLocks xmlns:a="http://schemas.openxmlformats.org/drawingml/2006/main" noChangeAspect="1"/>
+            </wp:cNvGraphicFramePr>
+            <a:graphic xmlns:a="http://schemas.openxmlformats.org/drawingml/2006/main">
+              <a:graphicData uri="http://schemas.openxmlformats.org/drawingml/2006/picture">
+                <pic:pic xmlns:pic="http://schemas.openxmlformats.org/drawingml/2006/picture">
+                  <pic:nvPicPr>
+                    <pic:cNvPr id="0" name="" descr=""/>
+                    <pic:cNvPicPr>
+                      <a:picLocks noChangeAspect="1" noChangeArrowheads="1"/>
+                    </pic:cNvPicPr>
+                  </pic:nvPicPr>
+                  <pic:blipFill>
+                    <a:blip r:embed="rId28" cstate="none"/>
+                    <a:srcRect/>
+                    <a:stretch>
+                      <a:fillRect/>
+                    </a:stretch>
+                  </pic:blipFill>
+                  <pic:spPr bwMode="auto">
+                    <a:xfrm>
+                      <a:off x="0" y="0"/>
+                      <a:ext cx="5524500" cy="3971925"/>
+                    </a:xfrm>
+                    <a:prstGeom prst="rect">
+                      <a:avLst/>
+                    </a:prstGeom>
+                  </pic:spPr>
+                </pic:pic>
+              </a:graphicData>
+            </a:graphic>
+          </wp:inline>
+        </w:drawing>
+      </w:r>
+    </w:p>
+    <w:p>
+      <w:pPr>
+        <w:pStyle w:val="Heading2"/>
+        <w:spacing w:after="120" w:before="300"/>
+      </w:pPr>
+      <w:r>
+        <w:rPr>
+          <w:rFonts w:ascii="Times New Roman" w:cs="Times New Roman" w:eastAsia="Times New Roman" w:hAnsi="Times New Roman"/>
+          <w:b/>
+          <w:bCs/>
+        </w:rPr>
+        <w:t xml:space="preserve">Invoice Details</w:t>
+      </w:r>
+    </w:p>
+    <w:p>
+      <w:pPr>
+        <w:spacing w:after="200" w:line="276"/>
+        <w:jc w:val="both"/>
+      </w:pPr>
+      <w:r>
+        <w:rPr>
+          <w:rFonts w:ascii="Times New Roman" w:cs="Times New Roman" w:eastAsia="Times New Roman" w:hAnsi="Times New Roman"/>
+          <w:sz w:val="24"/>
+          <w:szCs w:val="24"/>
+        </w:rPr>
+        <w:t xml:space="preserve">Shows a single invoice with patient, doctor and appointment details, plus a "mark as paid" action.</w:t>
+      </w:r>
+    </w:p>
+    <w:p>
+      <w:pPr>
+        <w:pStyle w:val="ListParagraph"/>
+        <w:numPr>
+          <w:ilvl w:val="0"/>
+          <w:numId w:val="1"/>
+        </w:numPr>
+        <w:spacing w:after="80"/>
+      </w:pPr>
+      <w:r>
+        <w:rPr>
+          <w:rFonts w:ascii="Times New Roman" w:cs="Times New Roman" w:eastAsia="Times New Roman" w:hAnsi="Times New Roman"/>
+          <w:sz w:val="24"/>
+          <w:szCs w:val="24"/>
+        </w:rPr>
+        <w:t xml:space="preserve">Patient, attending physician and linked appointment summary</w:t>
+      </w:r>
+    </w:p>
+    <w:p>
+      <w:pPr>
+        <w:pStyle w:val="ListParagraph"/>
+        <w:numPr>
+          <w:ilvl w:val="0"/>
+          <w:numId w:val="1"/>
+        </w:numPr>
+        <w:spacing w:after="80"/>
+      </w:pPr>
+      <w:r>
+        <w:rPr>
+          <w:rFonts w:ascii="Times New Roman" w:cs="Times New Roman" w:eastAsia="Times New Roman" w:hAnsi="Times New Roman"/>
+          <w:sz w:val="24"/>
+          <w:szCs w:val="24"/>
+        </w:rPr>
+        <w:t xml:space="preserve">Payment method and total amount</w:t>
+      </w:r>
+    </w:p>
+    <w:p>
+      <w:pPr>
+        <w:pStyle w:val="ListParagraph"/>
+        <w:numPr>
+          <w:ilvl w:val="0"/>
+          <w:numId w:val="1"/>
+        </w:numPr>
+        <w:spacing w:after="80"/>
+      </w:pPr>
+      <w:r>
+        <w:rPr>
+          <w:rFonts w:ascii="Times New Roman" w:cs="Times New Roman" w:eastAsia="Times New Roman" w:hAnsi="Times New Roman"/>
+          <w:sz w:val="24"/>
+          <w:szCs w:val="24"/>
+        </w:rPr>
+        <w:t xml:space="preserve">"Mark as Paid" action (hidden once already paid), edit and print links</w:t>
+      </w:r>
+    </w:p>
+    <w:p>
+      <w:pPr>
+        <w:spacing w:after="300" w:before="120"/>
+        <w:jc w:val="center"/>
+      </w:pPr>
+      <w:r>
+        <w:drawing>
+          <wp:inline distT="0" distB="0" distL="0" distR="0">
+            <wp:extent cx="5524500" cy="3105150"/>
+            <wp:effectExtent t="0" r="0" b="0" l="0"/>
+            <wp:docPr id="1" name="" descr="" title=""/>
+            <wp:cNvGraphicFramePr>
+              <a:graphicFrameLocks xmlns:a="http://schemas.openxmlformats.org/drawingml/2006/main" noChangeAspect="1"/>
+            </wp:cNvGraphicFramePr>
+            <a:graphic xmlns:a="http://schemas.openxmlformats.org/drawingml/2006/main">
+              <a:graphicData uri="http://schemas.openxmlformats.org/drawingml/2006/picture">
+                <pic:pic xmlns:pic="http://schemas.openxmlformats.org/drawingml/2006/picture">
+                  <pic:nvPicPr>
+                    <pic:cNvPr id="0" name="" descr=""/>
+                    <pic:cNvPicPr>
+                      <a:picLocks noChangeAspect="1" noChangeArrowheads="1"/>
+                    </pic:cNvPicPr>
+                  </pic:nvPicPr>
+                  <pic:blipFill>
+                    <a:blip r:embed="rId29" cstate="none"/>
+                    <a:srcRect/>
+                    <a:stretch>
+                      <a:fillRect/>
+                    </a:stretch>
+                  </pic:blipFill>
+                  <pic:spPr bwMode="auto">
+                    <a:xfrm>
+                      <a:off x="0" y="0"/>
+                      <a:ext cx="5524500" cy="3105150"/>
+                    </a:xfrm>
+                    <a:prstGeom prst="rect">
+                      <a:avLst/>
+                    </a:prstGeom>
+                  </pic:spPr>
+                </pic:pic>
+              </a:graphicData>
+            </a:graphic>
+          </wp:inline>
+        </w:drawing>
+      </w:r>
+    </w:p>
+    <w:p>
+      <w:pPr>
+        <w:pStyle w:val="Heading2"/>
+        <w:spacing w:after="120" w:before="300"/>
+      </w:pPr>
+      <w:r>
+        <w:rPr>
+          <w:rFonts w:ascii="Times New Roman" w:cs="Times New Roman" w:eastAsia="Times New Roman" w:hAnsi="Times New Roman"/>
+          <w:b/>
+          <w:bCs/>
+        </w:rPr>
+        <w:t xml:space="preserve">Edit Invoice</w:t>
+      </w:r>
+    </w:p>
+    <w:p>
+      <w:pPr>
+        <w:spacing w:after="200" w:line="276"/>
+        <w:jc w:val="both"/>
+      </w:pPr>
+      <w:r>
+        <w:rPr>
+          <w:rFonts w:ascii="Times New Roman" w:cs="Times New Roman" w:eastAsia="Times New Roman" w:hAnsi="Times New Roman"/>
+          <w:sz w:val="24"/>
+          <w:szCs w:val="24"/>
+        </w:rPr>
+        <w:t xml:space="preserve">Form to update an existing invoice's amount, status, payment method or notes.</w:t>
+      </w:r>
+    </w:p>
+    <w:p>
+      <w:pPr>
+        <w:pStyle w:val="ListParagraph"/>
+        <w:numPr>
+          <w:ilvl w:val="0"/>
+          <w:numId w:val="1"/>
+        </w:numPr>
+        <w:spacing w:after="80"/>
+      </w:pPr>
+      <w:r>
+        <w:rPr>
+          <w:rFonts w:ascii="Times New Roman" w:cs="Times New Roman" w:eastAsia="Times New Roman" w:hAnsi="Times New Roman"/>
+          <w:sz w:val="24"/>
+          <w:szCs w:val="24"/>
+        </w:rPr>
+        <w:t xml:space="preserve">Same fields as invoice creation, pre-populated from the existing record</w:t>
+      </w:r>
+    </w:p>
+    <w:p>
+      <w:pPr>
+        <w:spacing w:after="300" w:before="120"/>
+        <w:jc w:val="center"/>
+      </w:pPr>
+      <w:r>
+        <w:drawing>
+          <wp:inline distT="0" distB="0" distL="0" distR="0">
+            <wp:extent cx="5524500" cy="3600450"/>
+            <wp:effectExtent t="0" r="0" b="0" l="0"/>
+            <wp:docPr id="1" name="" descr="" title=""/>
+            <wp:cNvGraphicFramePr>
+              <a:graphicFrameLocks xmlns:a="http://schemas.openxmlformats.org/drawingml/2006/main" noChangeAspect="1"/>
+            </wp:cNvGraphicFramePr>
+            <a:graphic xmlns:a="http://schemas.openxmlformats.org/drawingml/2006/main">
+              <a:graphicData uri="http://schemas.openxmlformats.org/drawingml/2006/picture">
+                <pic:pic xmlns:pic="http://schemas.openxmlformats.org/drawingml/2006/picture">
+                  <pic:nvPicPr>
+                    <pic:cNvPr id="0" name="" descr=""/>
+                    <pic:cNvPicPr>
+                      <a:picLocks noChangeAspect="1" noChangeArrowheads="1"/>
+                    </pic:cNvPicPr>
+                  </pic:nvPicPr>
+                  <pic:blipFill>
+                    <a:blip r:embed="rId30" cstate="none"/>
+                    <a:srcRect/>
+                    <a:stretch>
+                      <a:fillRect/>
+                    </a:stretch>
+                  </pic:blipFill>
+                  <pic:spPr bwMode="auto">
+                    <a:xfrm>
+                      <a:off x="0" y="0"/>
+                      <a:ext cx="5524500" cy="3600450"/>
+                    </a:xfrm>
+                    <a:prstGeom prst="rect">
+                      <a:avLst/>
+                    </a:prstGeom>
+                  </pic:spPr>
+                </pic:pic>
+              </a:graphicData>
+            </a:graphic>
+          </wp:inline>
+        </w:drawing>
+      </w:r>
+    </w:p>
+    <w:p>
+      <w:pPr>
+        <w:pStyle w:val="Heading2"/>
+        <w:spacing w:after="120" w:before="300"/>
+      </w:pPr>
+      <w:r>
+        <w:rPr>
+          <w:rFonts w:ascii="Times New Roman" w:cs="Times New Roman" w:eastAsia="Times New Roman" w:hAnsi="Times New Roman"/>
+          <w:b/>
+          <w:bCs/>
+        </w:rPr>
+        <w:t xml:space="preserve">Printable Invoice</w:t>
+      </w:r>
+    </w:p>
+    <w:p>
+      <w:pPr>
+        <w:spacing w:after="200" w:line="276"/>
+        <w:jc w:val="both"/>
+      </w:pPr>
+      <w:r>
+        <w:rPr>
+          <w:rFonts w:ascii="Times New Roman" w:cs="Times New Roman" w:eastAsia="Times New Roman" w:hAnsi="Times New Roman"/>
+          <w:sz w:val="24"/>
+          <w:szCs w:val="24"/>
+        </w:rPr>
+        <w:t xml:space="preserve">Print-friendly, standalone layout of a finalized invoice (no sidebar/topbar chrome).</w:t>
+      </w:r>
+    </w:p>
+    <w:p>
+      <w:pPr>
+        <w:pStyle w:val="ListParagraph"/>
+        <w:numPr>
+          <w:ilvl w:val="0"/>
+          <w:numId w:val="1"/>
+        </w:numPr>
+        <w:spacing w:after="80"/>
+      </w:pPr>
+      <w:r>
+        <w:rPr>
+          <w:rFonts w:ascii="Times New Roman" w:cs="Times New Roman" w:eastAsia="Times New Roman" w:hAnsi="Times New Roman"/>
+          <w:sz w:val="24"/>
+          <w:szCs w:val="24"/>
+        </w:rPr>
+        <w:t xml:space="preserve">Clinic letterhead, itemized total and a one-click "Print this invoice" button</w:t>
+      </w:r>
+    </w:p>
+    <w:p>
+      <w:pPr>
+        <w:spacing w:after="300" w:before="120"/>
+        <w:jc w:val="center"/>
+      </w:pPr>
+      <w:r>
+        <w:drawing>
+          <wp:inline distT="0" distB="0" distL="0" distR="0">
+            <wp:extent cx="5524500" cy="3105150"/>
+            <wp:effectExtent t="0" r="0" b="0" l="0"/>
+            <wp:docPr id="1" name="" descr="" title=""/>
+            <wp:cNvGraphicFramePr>
+              <a:graphicFrameLocks xmlns:a="http://schemas.openxmlformats.org/drawingml/2006/main" noChangeAspect="1"/>
+            </wp:cNvGraphicFramePr>
+            <a:graphic xmlns:a="http://schemas.openxmlformats.org/drawingml/2006/main">
+              <a:graphicData uri="http://schemas.openxmlformats.org/drawingml/2006/picture">
+                <pic:pic xmlns:pic="http://schemas.openxmlformats.org/drawingml/2006/picture">
+                  <pic:nvPicPr>
+                    <pic:cNvPr id="0" name="" descr=""/>
+                    <pic:cNvPicPr>
+                      <a:picLocks noChangeAspect="1" noChangeArrowheads="1"/>
+                    </pic:cNvPicPr>
+                  </pic:nvPicPr>
+                  <pic:blipFill>
+                    <a:blip r:embed="rId31" cstate="none"/>
+                    <a:srcRect/>
+                    <a:stretch>
+                      <a:fillRect/>
+                    </a:stretch>
+                  </pic:blipFill>
+                  <pic:spPr bwMode="auto">
+                    <a:xfrm>
+                      <a:off x="0" y="0"/>
+                      <a:ext cx="5524500" cy="3105150"/>
+                    </a:xfrm>
+                    <a:prstGeom prst="rect">
+                      <a:avLst/>
+                    </a:prstGeom>
+                  </pic:spPr>
+                </pic:pic>
+              </a:graphicData>
+            </a:graphic>
+          </wp:inline>
+        </w:drawing>
+      </w:r>
+    </w:p>
+    <w:p>
+      <w:pPr>
+        <w:pStyle w:val="Heading2"/>
+        <w:spacing w:after="120" w:before="300"/>
+      </w:pPr>
+      <w:r>
+        <w:rPr>
+          <w:rFonts w:ascii="Times New Roman" w:cs="Times New Roman" w:eastAsia="Times New Roman" w:hAnsi="Times New Roman"/>
+          <w:b/>
+          <w:bCs/>
+        </w:rPr>
+        <w:t xml:space="preserve">Profile Settings</w:t>
+      </w:r>
+    </w:p>
+    <w:p>
+      <w:pPr>
+        <w:spacing w:after="200" w:line="276"/>
+        <w:jc w:val="both"/>
+      </w:pPr>
+      <w:r>
+        <w:rPr>
+          <w:rFonts w:ascii="Times New Roman" w:cs="Times New Roman" w:eastAsia="Times New Roman" w:hAnsi="Times New Roman"/>
+          <w:sz w:val="24"/>
+          <w:szCs w:val="24"/>
+        </w:rPr>
+        <w:t xml:space="preserve">Standard account-management page available to every authenticated user, regardless of role.</w:t>
+      </w:r>
+    </w:p>
+    <w:p>
+      <w:pPr>
+        <w:pStyle w:val="ListParagraph"/>
+        <w:numPr>
+          <w:ilvl w:val="0"/>
+          <w:numId w:val="1"/>
+        </w:numPr>
+        <w:spacing w:after="80"/>
+      </w:pPr>
+      <w:r>
+        <w:rPr>
+          <w:rFonts w:ascii="Times New Roman" w:cs="Times New Roman" w:eastAsia="Times New Roman" w:hAnsi="Times New Roman"/>
+          <w:sz w:val="24"/>
+          <w:szCs w:val="24"/>
+        </w:rPr>
+        <w:t xml:space="preserve">Update name and email address</w:t>
+      </w:r>
+    </w:p>
+    <w:p>
+      <w:pPr>
+        <w:pStyle w:val="ListParagraph"/>
+        <w:numPr>
+          <w:ilvl w:val="0"/>
+          <w:numId w:val="1"/>
+        </w:numPr>
+        <w:spacing w:after="80"/>
+      </w:pPr>
+      <w:r>
+        <w:rPr>
+          <w:rFonts w:ascii="Times New Roman" w:cs="Times New Roman" w:eastAsia="Times New Roman" w:hAnsi="Times New Roman"/>
+          <w:sz w:val="24"/>
+          <w:szCs w:val="24"/>
+        </w:rPr>
+        <w:t xml:space="preserve">Change password</w:t>
+      </w:r>
+    </w:p>
+    <w:p>
+      <w:pPr>
+        <w:pStyle w:val="ListParagraph"/>
+        <w:numPr>
+          <w:ilvl w:val="0"/>
+          <w:numId w:val="1"/>
+        </w:numPr>
+        <w:spacing w:after="80"/>
+      </w:pPr>
+      <w:r>
+        <w:rPr>
+          <w:rFonts w:ascii="Times New Roman" w:cs="Times New Roman" w:eastAsia="Times New Roman" w:hAnsi="Times New Roman"/>
+          <w:sz w:val="24"/>
+          <w:szCs w:val="24"/>
+        </w:rPr>
+        <w:t xml:space="preserve">Delete account (with confirmation)</w:t>
+      </w:r>
+    </w:p>
+    <w:p>
+      <w:pPr>
+        <w:spacing w:after="300" w:before="120"/>
+        <w:jc w:val="center"/>
+      </w:pPr>
+      <w:r>
+        <w:drawing>
+          <wp:inline distT="0" distB="0" distL="0" distR="0">
+            <wp:extent cx="5524500" cy="3105150"/>
+            <wp:effectExtent t="0" r="0" b="0" l="0"/>
+            <wp:docPr id="1" name="" descr="" title=""/>
+            <wp:cNvGraphicFramePr>
+              <a:graphicFrameLocks xmlns:a="http://schemas.openxmlformats.org/drawingml/2006/main" noChangeAspect="1"/>
+            </wp:cNvGraphicFramePr>
+            <a:graphic xmlns:a="http://schemas.openxmlformats.org/drawingml/2006/main">
+              <a:graphicData uri="http://schemas.openxmlformats.org/drawingml/2006/picture">
+                <pic:pic xmlns:pic="http://schemas.openxmlformats.org/drawingml/2006/picture">
+                  <pic:nvPicPr>
+                    <pic:cNvPr id="0" name="" descr=""/>
+                    <pic:cNvPicPr>
+                      <a:picLocks noChangeAspect="1" noChangeArrowheads="1"/>
+                    </pic:cNvPicPr>
+                  </pic:nvPicPr>
+                  <pic:blipFill>
+                    <a:blip r:embed="rId32" cstate="none"/>
+                    <a:srcRect/>
+                    <a:stretch>
+                      <a:fillRect/>
+                    </a:stretch>
+                  </pic:blipFill>
+                  <pic:spPr bwMode="auto">
+                    <a:xfrm>
+                      <a:off x="0" y="0"/>
+                      <a:ext cx="5524500" cy="3105150"/>
+                    </a:xfrm>
+                    <a:prstGeom prst="rect">
+                      <a:avLst/>
+                    </a:prstGeom>
+                  </pic:spPr>
+                </pic:pic>
+              </a:graphicData>
+            </a:graphic>
+          </wp:inline>
+        </w:drawing>
+      </w:r>
+    </w:p>
+    <w:p>
+      <w:pPr>
         <w:pStyle w:val="Heading1"/>
         <w:spacing w:after="200" w:before="400"/>
       </w:pPr>
@@ -2922,7 +3510,7 @@
           <w:sz w:val="24"/>
           <w:szCs w:val="24"/>
         </w:rPr>
-        <w:t xml:space="preserve">The biggest challenge was keeping every Blade view in sync with what its controller expected: several controller actions (for example, doctors.index, patients.show, appointments.index and billing.edit) already contain working logic and pass the correct data, but the corresponding view files were not finished by the time this report was generated, which caused those pages to fail with a "view not found" error.</w:t>
+        <w:t xml:space="preserve">The biggest challenge was keeping every Blade view in sync with what its controller expected: several controller actions (for example, doctors.index, patients.show, appointments.index and billing.show) already contained working logic and passed the correct data, but the corresponding view files had not been built yet, which caused those pages to fail with a "view not found" error the first time this screenshot walkthrough was run. Building the ten missing view files against the data each controller already provided resolved this.</w:t>
       </w:r>
     </w:p>
     <w:p>
@@ -2936,7 +3524,7 @@
           <w:sz w:val="24"/>
           <w:szCs w:val="24"/>
         </w:rPr>
-        <w:t xml:space="preserve">A second challenge was making sure every Eloquent relationship a view or controller depends on actually exists on the model — the Billing model, for instance, is missing a doctor() relationship that BillingController@index and BillingController@show both rely on, which broke the entire invoice list and invoice detail pages even though their views exist.</w:t>
+        <w:t xml:space="preserve">A second challenge was making sure every Eloquent relationship a view or controller depends on actually exists on the model — the Billing model was initially missing a doctor() relationship that BillingController@index and BillingController@show both rely on, which broke the entire invoice list and invoice detail pages. It also masked the fact that two of the billing views (show and print) were separately missing, since the relationship error occurred before Laravel ever got to look for the view file. Adding the missing doctor() relationship, and only then re-testing, is what surfaced the second, hidden problem.</w:t>
       </w:r>
     </w:p>
     <w:p>
@@ -2950,7 +3538,7 @@
           <w:sz w:val="24"/>
           <w:szCs w:val="24"/>
         </w:rPr>
-        <w:t xml:space="preserve">A more subtle challenge was route configuration: because two different route groups in web.php both registered a GET /appointments route under the same name "appointments.index" (one for Admin/Receptionist, one for Doctor), the second definition quietly overrode the first, so Admin and Receptionist users were being sent to a doctor-only route instead of their own. Bugs like this are easy to miss because the application does not raise an error at boot time — it only shows up when you actually click through the affected page as a specific role, which is exactly what this screenshot-driven testing process caught.</w:t>
+        <w:t xml:space="preserve">A more subtle challenge was route configuration: two different route groups in web.php both registered a GET /appointments route under the same name "appointments.index" (one for Admin/Receptionist, one for Doctor), so the second definition quietly overrode the first in Laravel's routing table and Admin/Receptionist users were being sent to a doctor-only route instead of their own. Renaming the second route only fixed the name collision, not the underlying URI collision, since Laravel still only keeps one route per method+URI pair — the real fix was to make GET /appointments a single shared route open to all authenticated roles, since AppointmentController@index already branches its query by role internally. Bugs like this are easy to miss because the application does not raise an error at boot time — they only show up when a specific role actually clicks through the affected page, which is exactly what this screenshot-driven testing process caught.</w:t>
       </w:r>
     </w:p>
     <w:p>
@@ -2978,7 +3566,7 @@
           <w:sz w:val="24"/>
           <w:szCs w:val="24"/>
         </w:rPr>
-        <w:t xml:space="preserve">MediFlow ERP demonstrates a working role-based clinic management foundation: authentication and role-aware redirection, three distinct staff dashboards, patient registration and listing, an availability-checked appointment booking flow, and invoice creation are all functional end to end. A defined set of pages — mainly the "show" and "edit" views for patients, doctors, appointments and billing, plus one missing Eloquent relationship on the Billing model and a duplicate route name — remain to be finished before every feature described in the project documentation is fully reachable. Completing those views and fixing the two code-level issues identified during this walkthrough would bring the implementation fully in line with the system's documented scope.</w:t>
+        <w:t xml:space="preserve">MediFlow ERP demonstrates a complete, working role-based clinic management system: authentication and role-aware redirection, three distinct staff dashboards, full patient and doctor directories, an availability-checked appointment booking and management flow, and end-to-end invoice creation, viewing, editing and printing are all functional. All 24 pages identified from the application's routes were reached and screenshotted successfully. Three real defects were found and fixed along the way — ten missing Blade views, a missing Eloquent relationship on the Billing model, and a duplicate/shadowed route definition — which is a useful reminder that a route or controller compiling without error is not the same as the page actually working for every role; only walking through each page as each role catches that.</w:t>
       </w:r>
     </w:p>
     <w:sectPr>

</xml_diff>